<commit_message>
Add Zenodo metadata, citation file and Zenodo reference in report
Co-Authored-By: Claude Opus 5.5 <noreply@anthropic.com>
Claude-Session: https://claude.ai/code/session_01Tjp7tKuW9QND1aAEqAWhGA
</commit_message>
<xml_diff>
--- a/docs/Drone_Acoustic_Guidance_Report_EN_v2.docx
+++ b/docs/Drone_Acoustic_Guidance_Report_EN_v2.docx
@@ -106,7 +106,7 @@
         <w:spacing w:after="60"/>
         <w:jc w:val="center"/>
       </w:pPr>
-      <w:hyperlink w:history="1" r:id="rIdh9gt3ei83vokhy9ttkgfn">
+      <w:hyperlink w:history="1" r:id="rIdgbenm3u0vr7c_vupmyhrh">
         <w:r>
           <w:rPr>
             <w:rStyle w:val="Hyperlink"/>
@@ -117,6 +117,7 @@
     </w:p>
     <w:p>
       <w:pPr>
+        <w:spacing w:after="200"/>
         <w:jc w:val="center"/>
       </w:pPr>
       <w:r>
@@ -127,6 +128,33 @@
         </w:rPr>
         <w:t xml:space="preserve">(branch: claude/epic-ride-9fqd2p)</w:t>
       </w:r>
+    </w:p>
+    <w:p>
+      <w:pPr>
+        <w:spacing w:after="60"/>
+        <w:jc w:val="center"/>
+      </w:pPr>
+      <w:r>
+        <w:rPr>
+          <w:color w:val="595959"/>
+          <w:sz w:val="20"/>
+          <w:szCs w:val="20"/>
+        </w:rPr>
+        <w:t xml:space="preserve">Archived on Zenodo:</w:t>
+      </w:r>
+    </w:p>
+    <w:p>
+      <w:pPr>
+        <w:jc w:val="center"/>
+      </w:pPr>
+      <w:hyperlink w:history="1" r:id="rIdut_plov23bipkbue_y9im">
+        <w:r>
+          <w:rPr>
+            <w:rStyle w:val="Hyperlink"/>
+          </w:rPr>
+          <w:t xml:space="preserve">DOI: 10.5281/zenodo.XXXXXXX</w:t>
+        </w:r>
+      </w:hyperlink>
     </w:p>
     <w:p>
       <w:r>
@@ -1032,6 +1060,126 @@
                 <w:sz w:val="19"/>
                 <w:szCs w:val="19"/>
               </w:rPr>
+              <w:t xml:space="preserve">Archiving and citation</w:t>
+            </w:r>
+          </w:p>
+        </w:tc>
+        <w:tc>
+          <w:tcPr>
+            <w:tcW w:type="dxa" w:w="3000"/>
+            <w:tcBorders>
+              <w:top w:val="single" w:color="A6A6A6" w:sz="4"/>
+              <w:left w:val="single" w:color="A6A6A6" w:sz="4"/>
+              <w:bottom w:val="single" w:color="A6A6A6" w:sz="4"/>
+              <w:right w:val="single" w:color="A6A6A6" w:sz="4"/>
+            </w:tcBorders>
+            <w:tcMar>
+              <w:top w:type="dxa" w:w="50"/>
+              <w:left w:type="dxa" w:w="90"/>
+              <w:bottom w:type="dxa" w:w="50"/>
+              <w:right w:type="dxa" w:w="90"/>
+            </w:tcMar>
+          </w:tcPr>
+          <w:p>
+            <w:pPr>
+              <w:jc w:val="left"/>
+            </w:pPr>
+            <w:r>
+              <w:rPr>
+                <w:sz w:val="19"/>
+                <w:szCs w:val="19"/>
+              </w:rPr>
+              <w:t xml:space="preserve">None</w:t>
+            </w:r>
+          </w:p>
+        </w:tc>
+        <w:tc>
+          <w:tcPr>
+            <w:tcW w:type="dxa" w:w="4170"/>
+            <w:tcBorders>
+              <w:top w:val="single" w:color="A6A6A6" w:sz="4"/>
+              <w:left w:val="single" w:color="A6A6A6" w:sz="4"/>
+              <w:bottom w:val="single" w:color="A6A6A6" w:sz="4"/>
+              <w:right w:val="single" w:color="A6A6A6" w:sz="4"/>
+            </w:tcBorders>
+            <w:tcMar>
+              <w:top w:type="dxa" w:w="50"/>
+              <w:left w:type="dxa" w:w="90"/>
+              <w:bottom w:type="dxa" w:w="50"/>
+              <w:right w:type="dxa" w:w="90"/>
+            </w:tcMar>
+          </w:tcPr>
+          <w:p>
+            <w:pPr>
+              <w:jc w:val="left"/>
+            </w:pPr>
+            <w:r>
+              <w:rPr>
+                <w:sz w:val="19"/>
+                <w:szCs w:val="19"/>
+              </w:rPr>
+              <w:t xml:space="preserve">Zenodo archive with DOI linked to the GitHub repository; </w:t>
+            </w:r>
+            <w:r>
+              <w:rPr>
+                <w:rFonts w:ascii="Consolas" w:cs="Consolas" w:eastAsia="Consolas" w:hAnsi="Consolas"/>
+                <w:sz w:val="19"/>
+                <w:szCs w:val="19"/>
+              </w:rPr>
+              <w:t xml:space="preserve">CITATION.cff</w:t>
+            </w:r>
+            <w:r>
+              <w:rPr>
+                <w:sz w:val="19"/>
+                <w:szCs w:val="19"/>
+              </w:rPr>
+              <w:t xml:space="preserve"> and </w:t>
+            </w:r>
+            <w:r>
+              <w:rPr>
+                <w:rFonts w:ascii="Consolas" w:cs="Consolas" w:eastAsia="Consolas" w:hAnsi="Consolas"/>
+                <w:sz w:val="19"/>
+                <w:szCs w:val="19"/>
+              </w:rPr>
+              <w:t xml:space="preserve">.zenodo.json</w:t>
+            </w:r>
+            <w:r>
+              <w:rPr>
+                <w:sz w:val="19"/>
+                <w:szCs w:val="19"/>
+              </w:rPr>
+              <w:t xml:space="preserve"> metadata [25]</w:t>
+            </w:r>
+          </w:p>
+        </w:tc>
+      </w:tr>
+      <w:tr>
+        <w:tc>
+          <w:tcPr>
+            <w:tcW w:type="dxa" w:w="1900"/>
+            <w:tcBorders>
+              <w:top w:val="single" w:color="A6A6A6" w:sz="4"/>
+              <w:left w:val="single" w:color="A6A6A6" w:sz="4"/>
+              <w:bottom w:val="single" w:color="A6A6A6" w:sz="4"/>
+              <w:right w:val="single" w:color="A6A6A6" w:sz="4"/>
+            </w:tcBorders>
+            <w:shd w:fill="F5F7FB" w:color="auto" w:val="clear"/>
+            <w:tcMar>
+              <w:top w:type="dxa" w:w="50"/>
+              <w:left w:type="dxa" w:w="90"/>
+              <w:bottom w:type="dxa" w:w="50"/>
+              <w:right w:type="dxa" w:w="90"/>
+            </w:tcMar>
+          </w:tcPr>
+          <w:p>
+            <w:pPr>
+              <w:jc w:val="left"/>
+            </w:pPr>
+            <w:r>
+              <w:rPr>
+                <w:sz w:val="19"/>
+                <w:szCs w:val="19"/>
+              </w:rPr>
               <w:t xml:space="preserve">Report organization</w:t>
             </w:r>
           </w:p>
@@ -1045,6 +1193,7 @@
               <w:bottom w:val="single" w:color="A6A6A6" w:sz="4"/>
               <w:right w:val="single" w:color="A6A6A6" w:sz="4"/>
             </w:tcBorders>
+            <w:shd w:fill="F5F7FB" w:color="auto" w:val="clear"/>
             <w:tcMar>
               <w:top w:type="dxa" w:w="50"/>
               <w:left w:type="dxa" w:w="90"/>
@@ -1074,23 +1223,24 @@
               <w:bottom w:val="single" w:color="A6A6A6" w:sz="4"/>
               <w:right w:val="single" w:color="A6A6A6" w:sz="4"/>
             </w:tcBorders>
-            <w:tcMar>
-              <w:top w:type="dxa" w:w="50"/>
-              <w:left w:type="dxa" w:w="90"/>
-              <w:bottom w:type="dxa" w:w="50"/>
-              <w:right w:type="dxa" w:w="90"/>
-            </w:tcMar>
-          </w:tcPr>
-          <w:p>
-            <w:pPr>
-              <w:jc w:val="left"/>
-            </w:pPr>
-            <w:r>
-              <w:rPr>
-                <w:sz w:val="19"/>
-                <w:szCs w:val="19"/>
-              </w:rPr>
-              <w:t xml:space="preserve">Data reorganized into tables; notes converted to Section 3.3 and Appendix B; references 17–24 added</w:t>
+            <w:shd w:fill="F5F7FB" w:color="auto" w:val="clear"/>
+            <w:tcMar>
+              <w:top w:type="dxa" w:w="50"/>
+              <w:left w:type="dxa" w:w="90"/>
+              <w:bottom w:type="dxa" w:w="50"/>
+              <w:right w:type="dxa" w:w="90"/>
+            </w:tcMar>
+          </w:tcPr>
+          <w:p>
+            <w:pPr>
+              <w:jc w:val="left"/>
+            </w:pPr>
+            <w:r>
+              <w:rPr>
+                <w:sz w:val="19"/>
+                <w:szCs w:val="19"/>
+              </w:rPr>
+              <w:t xml:space="preserve">Data reorganized into tables; notes converted to Section 3.3 and Appendix B; references 17–25 added</w:t>
             </w:r>
           </w:p>
         </w:tc>
@@ -17794,585 +17944,18 @@
         <w:pStyle w:val="Heading1"/>
       </w:pPr>
       <w:r>
-        <w:t xml:space="preserve">References</w:t>
-      </w:r>
-    </w:p>
-    <w:p>
-      <w:pPr>
-        <w:tabs>
-          <w:tab w:val="left" w:pos="480"/>
-        </w:tabs>
-        <w:spacing w:after="80"/>
-        <w:ind w:left="480" w:hanging="480"/>
-      </w:pPr>
-      <w:r>
-        <w:rPr>
-          <w:sz w:val="20"/>
-          <w:szCs w:val="20"/>
-        </w:rPr>
-        <w:t xml:space="preserve">[1]	</w:t>
-      </w:r>
-      <w:r>
-        <w:rPr>
-          <w:sz w:val="20"/>
-          <w:szCs w:val="20"/>
-        </w:rPr>
-        <w:t xml:space="preserve">C. H. Knapp and G. C. Carter, "The generalized correlation method for estimation of time delay," IEEE Trans. Acoustics, Speech, and Signal Processing, vol. 24, no. 4, pp. 320–327, 1976.</w:t>
-      </w:r>
-    </w:p>
-    <w:p>
-      <w:pPr>
-        <w:tabs>
-          <w:tab w:val="left" w:pos="480"/>
-        </w:tabs>
-        <w:spacing w:after="80"/>
-        <w:ind w:left="480" w:hanging="480"/>
-      </w:pPr>
-      <w:r>
-        <w:rPr>
-          <w:sz w:val="20"/>
-          <w:szCs w:val="20"/>
-        </w:rPr>
-        <w:t xml:space="preserve">[2]	</w:t>
-      </w:r>
-      <w:r>
-        <w:rPr>
-          <w:sz w:val="20"/>
-          <w:szCs w:val="20"/>
-        </w:rPr>
-        <w:t xml:space="preserve">R. O. Schmidt, "Multiple emitter location and signal parameter estimation," IEEE Trans. Antennas and Propagation, vol. 34, no. 3, pp. 276–280, 1986.</w:t>
-      </w:r>
-    </w:p>
-    <w:p>
-      <w:pPr>
-        <w:tabs>
-          <w:tab w:val="left" w:pos="480"/>
-        </w:tabs>
-        <w:spacing w:after="80"/>
-        <w:ind w:left="480" w:hanging="480"/>
-      </w:pPr>
-      <w:r>
-        <w:rPr>
-          <w:sz w:val="20"/>
-          <w:szCs w:val="20"/>
-        </w:rPr>
-        <w:t xml:space="preserve">[3]	</w:t>
-      </w:r>
-      <w:r>
-        <w:rPr>
-          <w:sz w:val="20"/>
-          <w:szCs w:val="20"/>
-        </w:rPr>
-        <w:t xml:space="preserve">J.-M. Valin, F. Michaud, J. Rouat, and D. Létourneau, "Robust sound source localization using a microphone array on a mobile robot," in Proc. IEEE/RSJ IROS, 2003.</w:t>
-      </w:r>
-    </w:p>
-    <w:p>
-      <w:pPr>
-        <w:tabs>
-          <w:tab w:val="left" w:pos="480"/>
-        </w:tabs>
-        <w:spacing w:after="80"/>
-        <w:ind w:left="480" w:hanging="480"/>
-      </w:pPr>
-      <w:r>
-        <w:rPr>
-          <w:sz w:val="20"/>
-          <w:szCs w:val="20"/>
-        </w:rPr>
-        <w:t xml:space="preserve">[4]	</w:t>
-      </w:r>
-      <w:r>
-        <w:rPr>
-          <w:sz w:val="20"/>
-          <w:szCs w:val="20"/>
-        </w:rPr>
-        <w:t xml:space="preserve">K. Nakadai, T. Takahashi, H. G. Okuno, H. Nakajima, Y. Hasegawa, and H. Tsujino, "Design and implementation of robot audition system 'HARK' — open source software for listening to three simultaneous speakers," Advanced Robotics, vol. 24, no. 5–6, pp. 739–761, 2010.</w:t>
-      </w:r>
-    </w:p>
-    <w:p>
-      <w:pPr>
-        <w:tabs>
-          <w:tab w:val="left" w:pos="480"/>
-        </w:tabs>
-        <w:spacing w:after="80"/>
-        <w:ind w:left="480" w:hanging="480"/>
-      </w:pPr>
-      <w:r>
-        <w:rPr>
-          <w:sz w:val="20"/>
-          <w:szCs w:val="20"/>
-        </w:rPr>
-        <w:t xml:space="preserve">[5]	</w:t>
-      </w:r>
-      <w:r>
-        <w:rPr>
-          <w:sz w:val="20"/>
-          <w:szCs w:val="20"/>
-        </w:rPr>
-        <w:t xml:space="preserve">M. Basiri, F. Schill, P. U. Lima, and D. Floreano, "Robust acoustic source localization of emergency signals from micro air vehicles," in Proc. IEEE/RSJ IROS, 2012.</w:t>
-      </w:r>
-    </w:p>
-    <w:p>
-      <w:pPr>
-        <w:tabs>
-          <w:tab w:val="left" w:pos="480"/>
-        </w:tabs>
-        <w:spacing w:after="80"/>
-        <w:ind w:left="480" w:hanging="480"/>
-      </w:pPr>
-      <w:r>
-        <w:rPr>
-          <w:sz w:val="20"/>
-          <w:szCs w:val="20"/>
-        </w:rPr>
-        <w:t xml:space="preserve">[6]	</w:t>
-      </w:r>
-      <w:r>
-        <w:rPr>
-          <w:sz w:val="20"/>
-          <w:szCs w:val="20"/>
-        </w:rPr>
-        <w:t xml:space="preserve">K. Furukawa, K. Okutani, K. Nagira, T. Otsuka, K. Itoyama, K. Nakadai, and H. G. Okuno, "Noise correlation matrix estimation for improving sound source localization by multirotor UAV," in Proc. IEEE/RSJ IROS, 2013.</w:t>
-      </w:r>
-    </w:p>
-    <w:p>
-      <w:pPr>
-        <w:tabs>
-          <w:tab w:val="left" w:pos="480"/>
-        </w:tabs>
-        <w:spacing w:after="80"/>
-        <w:ind w:left="480" w:hanging="480"/>
-      </w:pPr>
-      <w:r>
-        <w:rPr>
-          <w:sz w:val="20"/>
-          <w:szCs w:val="20"/>
-        </w:rPr>
-        <w:t xml:space="preserve">[7]	</w:t>
-      </w:r>
-      <w:r>
-        <w:rPr>
-          <w:sz w:val="20"/>
-          <w:szCs w:val="20"/>
-        </w:rPr>
-        <w:t xml:space="preserve">L. Wang and A. Cavallaro, "Ear in the sky: Ego-noise reduction for auditory micro aerial vehicles," in Proc. IEEE AVSS, 2016.</w:t>
-      </w:r>
-    </w:p>
-    <w:p>
-      <w:pPr>
-        <w:tabs>
-          <w:tab w:val="left" w:pos="480"/>
-        </w:tabs>
-        <w:spacing w:after="80"/>
-        <w:ind w:left="480" w:hanging="480"/>
-      </w:pPr>
-      <w:r>
-        <w:rPr>
-          <w:sz w:val="20"/>
-          <w:szCs w:val="20"/>
-        </w:rPr>
-        <w:t xml:space="preserve">[8]	</w:t>
-      </w:r>
-      <w:r>
-        <w:rPr>
-          <w:sz w:val="20"/>
-          <w:szCs w:val="20"/>
-        </w:rPr>
-        <w:t xml:space="preserve">Y. Hioka, M. Kingan, G. Schmid, and K. A. Stol, "Speech enhancement using a microphone array mounted on an unmanned aerial vehicle," in Proc. IWAENC, 2016.</w:t>
-      </w:r>
-    </w:p>
-    <w:p>
-      <w:pPr>
-        <w:tabs>
-          <w:tab w:val="left" w:pos="480"/>
-        </w:tabs>
-        <w:spacing w:after="80"/>
-        <w:ind w:left="480" w:hanging="480"/>
-      </w:pPr>
-      <w:r>
-        <w:rPr>
-          <w:sz w:val="20"/>
-          <w:szCs w:val="20"/>
-        </w:rPr>
-        <w:t xml:space="preserve">[9]	</w:t>
-      </w:r>
-      <w:r>
-        <w:rPr>
-          <w:sz w:val="20"/>
-          <w:szCs w:val="20"/>
-        </w:rPr>
-        <w:t xml:space="preserve">M. Strauss, P. Mordel, V. Miguet, and A. Deleforge, "DREGON: Dataset and methods for UAV-embedded sound source localization," in Proc. IEEE/RSJ IROS, 2018. Data: http://dregon.inria.fr</w:t>
-      </w:r>
-    </w:p>
-    <w:p>
-      <w:pPr>
-        <w:tabs>
-          <w:tab w:val="left" w:pos="480"/>
-        </w:tabs>
-        <w:spacing w:after="80"/>
-        <w:ind w:left="480" w:hanging="480"/>
-      </w:pPr>
-      <w:r>
-        <w:rPr>
-          <w:sz w:val="20"/>
-          <w:szCs w:val="20"/>
-        </w:rPr>
-        <w:t xml:space="preserve">[10]	</w:t>
-      </w:r>
-      <w:r>
-        <w:rPr>
-          <w:sz w:val="20"/>
-          <w:szCs w:val="20"/>
-        </w:rPr>
-        <w:t xml:space="preserve">S. F. Boll, "Suppression of acoustic noise in speech using spectral subtraction," IEEE Trans. Acoustics, Speech, and Signal Processing, vol. 27, no. 2, pp. 113–120, 1979.</w:t>
-      </w:r>
-    </w:p>
-    <w:p>
-      <w:pPr>
-        <w:tabs>
-          <w:tab w:val="left" w:pos="480"/>
-        </w:tabs>
-        <w:spacing w:after="80"/>
-        <w:ind w:left="480" w:hanging="480"/>
-      </w:pPr>
-      <w:r>
-        <w:rPr>
-          <w:sz w:val="20"/>
-          <w:szCs w:val="20"/>
-        </w:rPr>
-        <w:t xml:space="preserve">[11]	</w:t>
-      </w:r>
-      <w:r>
-        <w:rPr>
-          <w:sz w:val="20"/>
-          <w:szCs w:val="20"/>
-        </w:rPr>
-        <w:t xml:space="preserve">B. Widrow et al., "Adaptive noise cancelling: Principles and applications," Proceedings of the IEEE, vol. 63, no. 12, pp. 1692–1716, 1975.</w:t>
-      </w:r>
-    </w:p>
-    <w:p>
-      <w:pPr>
-        <w:tabs>
-          <w:tab w:val="left" w:pos="480"/>
-        </w:tabs>
-        <w:spacing w:after="80"/>
-        <w:ind w:left="480" w:hanging="480"/>
-      </w:pPr>
-      <w:r>
-        <w:rPr>
-          <w:sz w:val="20"/>
-          <w:szCs w:val="20"/>
-        </w:rPr>
-        <w:t xml:space="preserve">[12]	</w:t>
-      </w:r>
-      <w:r>
-        <w:rPr>
-          <w:sz w:val="20"/>
-          <w:szCs w:val="20"/>
-        </w:rPr>
-        <w:t xml:space="preserve">R. E. Kalman, "A new approach to linear filtering and prediction problems," Journal of Basic Engineering, vol. 82, no. 1, pp. 35–45, 1960.</w:t>
-      </w:r>
-    </w:p>
-    <w:p>
-      <w:pPr>
-        <w:tabs>
-          <w:tab w:val="left" w:pos="480"/>
-        </w:tabs>
-        <w:spacing w:after="80"/>
-        <w:ind w:left="480" w:hanging="480"/>
-      </w:pPr>
-      <w:r>
-        <w:rPr>
-          <w:sz w:val="20"/>
-          <w:szCs w:val="20"/>
-        </w:rPr>
-        <w:t xml:space="preserve">[13]	</w:t>
-      </w:r>
-      <w:r>
-        <w:rPr>
-          <w:sz w:val="20"/>
-          <w:szCs w:val="20"/>
-        </w:rPr>
-        <w:t xml:space="preserve">Y. Bar-Shalom, X. R. Li, and T. Kirubarajan, Estimation with Applications to Tracking and Navigation. New York: Wiley, 2001.</w:t>
-      </w:r>
-    </w:p>
-    <w:p>
-      <w:pPr>
-        <w:tabs>
-          <w:tab w:val="left" w:pos="480"/>
-        </w:tabs>
-        <w:spacing w:after="80"/>
-        <w:ind w:left="480" w:hanging="480"/>
-      </w:pPr>
-      <w:r>
-        <w:rPr>
-          <w:sz w:val="20"/>
-          <w:szCs w:val="20"/>
-        </w:rPr>
-        <w:t xml:space="preserve">[14]	</w:t>
-      </w:r>
-      <w:r>
-        <w:rPr>
-          <w:sz w:val="20"/>
-          <w:szCs w:val="20"/>
-        </w:rPr>
-        <w:t xml:space="preserve">L. Meier, D. Honegger, and M. Pollefeys, "PX4: A node-based multithreaded open source robotics framework for deeply embedded platforms," in Proc. IEEE ICRA, 2015.</w:t>
-      </w:r>
-    </w:p>
-    <w:p>
-      <w:pPr>
-        <w:tabs>
-          <w:tab w:val="left" w:pos="480"/>
-        </w:tabs>
-        <w:spacing w:after="80"/>
-        <w:ind w:left="480" w:hanging="480"/>
-      </w:pPr>
-      <w:r>
-        <w:rPr>
-          <w:sz w:val="20"/>
-          <w:szCs w:val="20"/>
-        </w:rPr>
-        <w:t xml:space="preserve">[15]	</w:t>
-      </w:r>
-      <w:r>
-        <w:rPr>
-          <w:sz w:val="20"/>
-          <w:szCs w:val="20"/>
-        </w:rPr>
-        <w:t xml:space="preserve">E. Olson, "AprilTag: A robust and flexible visual fiducial system," in Proc. IEEE ICRA, 2011.</w:t>
-      </w:r>
-    </w:p>
-    <w:p>
-      <w:pPr>
-        <w:tabs>
-          <w:tab w:val="left" w:pos="480"/>
-        </w:tabs>
-        <w:spacing w:after="80"/>
-        <w:ind w:left="480" w:hanging="480"/>
-      </w:pPr>
-      <w:r>
-        <w:rPr>
-          <w:sz w:val="20"/>
-          <w:szCs w:val="20"/>
-        </w:rPr>
-        <w:t xml:space="preserve">[16]	</w:t>
-      </w:r>
-      <w:r>
-        <w:rPr>
-          <w:sz w:val="20"/>
-          <w:szCs w:val="20"/>
-        </w:rPr>
-        <w:t xml:space="preserve">K. A. O. Suzuki, P. Kemper Filho, and J. R. Morrison, "Automatic battery replacement system for UAVs: Analysis and design," Journal of Intelligent &amp; Robotic Systems, vol. 65, pp. 563–586, 2012.</w:t>
-      </w:r>
-    </w:p>
-    <w:p>
-      <w:pPr>
-        <w:tabs>
-          <w:tab w:val="left" w:pos="480"/>
-        </w:tabs>
-        <w:spacing w:after="80"/>
-        <w:ind w:left="480" w:hanging="480"/>
-      </w:pPr>
-      <w:r>
-        <w:rPr>
-          <w:sz w:val="20"/>
-          <w:szCs w:val="20"/>
-        </w:rPr>
-        <w:t xml:space="preserve">[17]	</w:t>
-      </w:r>
-      <w:r>
-        <w:rPr>
-          <w:sz w:val="20"/>
-          <w:szCs w:val="20"/>
-        </w:rPr>
-        <w:t xml:space="preserve">S. Al-Emadi, A. Al-Ali, A. Mohammad, and A. Al-Ali, "Audio based drone detection and identification using deep learning," in Proc. 15th Int. Wireless Communications &amp; Mobile Computing Conf. (IWCMC), 2019, pp. 459–464. Data: https://github.com/saraalemadi/DroneAudioDataset</w:t>
-      </w:r>
-    </w:p>
-    <w:p>
-      <w:pPr>
-        <w:tabs>
-          <w:tab w:val="left" w:pos="480"/>
-        </w:tabs>
-        <w:spacing w:after="80"/>
-        <w:ind w:left="480" w:hanging="480"/>
-      </w:pPr>
-      <w:r>
-        <w:rPr>
-          <w:sz w:val="20"/>
-          <w:szCs w:val="20"/>
-        </w:rPr>
-        <w:t xml:space="preserve">[18]	</w:t>
-      </w:r>
-      <w:r>
-        <w:rPr>
-          <w:sz w:val="20"/>
-          <w:szCs w:val="20"/>
-        </w:rPr>
-        <w:t xml:space="preserve">F. Svanström, F. Alonso-Fernandez, and C. Englund, "A dataset for multi-sensor drone detection," Data in Brief, vol. 39, 107521, 2021. Data: https://github.com/DroneDetectionThesis/Drone-detection-dataset</w:t>
-      </w:r>
-    </w:p>
-    <w:p>
-      <w:pPr>
-        <w:tabs>
-          <w:tab w:val="left" w:pos="480"/>
-        </w:tabs>
-        <w:spacing w:after="80"/>
-        <w:ind w:left="480" w:hanging="480"/>
-      </w:pPr>
-      <w:r>
-        <w:rPr>
-          <w:sz w:val="20"/>
-          <w:szCs w:val="20"/>
-        </w:rPr>
-        <w:t xml:space="preserve">[19]	</w:t>
-      </w:r>
-      <w:r>
-        <w:rPr>
-          <w:sz w:val="20"/>
-          <w:szCs w:val="20"/>
-        </w:rPr>
-        <w:t xml:space="preserve">K. J. Piczak, "ESC: Dataset for environmental sound classification," in Proc. 23rd ACM Int. Conf. on Multimedia, 2015, pp. 1015–1018. Data: https://github.com/karolpiczak/ESC-50</w:t>
-      </w:r>
-    </w:p>
-    <w:p>
-      <w:pPr>
-        <w:tabs>
-          <w:tab w:val="left" w:pos="480"/>
-        </w:tabs>
-        <w:spacing w:after="80"/>
-        <w:ind w:left="480" w:hanging="480"/>
-      </w:pPr>
-      <w:r>
-        <w:rPr>
-          <w:sz w:val="20"/>
-          <w:szCs w:val="20"/>
-        </w:rPr>
-        <w:t xml:space="preserve">[20]	</w:t>
-      </w:r>
-      <w:r>
-        <w:rPr>
-          <w:sz w:val="20"/>
-          <w:szCs w:val="20"/>
-        </w:rPr>
-        <w:t xml:space="preserve">A. Deleforge, D. Di Carlo, M. Strauss, R. Serizel, and L. Marcenaro, "Audio-based search and rescue with a drone: Highlights from the IEEE Signal Processing Cup 2019 student competition," IEEE Signal Processing Magazine, vol. 36, no. 5, pp. 138–144, 2019.</w:t>
-      </w:r>
-    </w:p>
-    <w:p>
-      <w:pPr>
-        <w:tabs>
-          <w:tab w:val="left" w:pos="480"/>
-        </w:tabs>
-        <w:spacing w:after="80"/>
-        <w:ind w:left="480" w:hanging="480"/>
-      </w:pPr>
-      <w:r>
-        <w:rPr>
-          <w:sz w:val="20"/>
-          <w:szCs w:val="20"/>
-        </w:rPr>
-        <w:t xml:space="preserve">[21]	</w:t>
-      </w:r>
-      <w:r>
-        <w:rPr>
-          <w:sz w:val="20"/>
-          <w:szCs w:val="20"/>
-        </w:rPr>
-        <w:t xml:space="preserve">J. H. DiBiase, H. F. Silverman, and M. S. Brandstein, "Robust localization in reverberant rooms," in Microphone Arrays: Signal Processing Techniques and Applications, M. Brandstein and D. Ward, Eds. Berlin: Springer, 2001, pp. 157–180.</w:t>
-      </w:r>
-    </w:p>
-    <w:p>
-      <w:pPr>
-        <w:tabs>
-          <w:tab w:val="left" w:pos="480"/>
-        </w:tabs>
-        <w:spacing w:after="80"/>
-        <w:ind w:left="480" w:hanging="480"/>
-      </w:pPr>
-      <w:r>
-        <w:rPr>
-          <w:sz w:val="20"/>
-          <w:szCs w:val="20"/>
-        </w:rPr>
-        <w:t xml:space="preserve">[22]	</w:t>
-      </w:r>
-      <w:r>
-        <w:rPr>
-          <w:sz w:val="20"/>
-          <w:szCs w:val="20"/>
-        </w:rPr>
-        <w:t xml:space="preserve">L. Breiman, "Random forests," Machine Learning, vol. 45, no. 1, pp. 5–32, 2001.</w:t>
-      </w:r>
-    </w:p>
-    <w:p>
-      <w:pPr>
-        <w:tabs>
-          <w:tab w:val="left" w:pos="480"/>
-        </w:tabs>
-        <w:spacing w:after="80"/>
-        <w:ind w:left="480" w:hanging="480"/>
-      </w:pPr>
-      <w:r>
-        <w:rPr>
-          <w:sz w:val="20"/>
-          <w:szCs w:val="20"/>
-        </w:rPr>
-        <w:t xml:space="preserve">[23]	</w:t>
-      </w:r>
-      <w:r>
-        <w:rPr>
-          <w:sz w:val="20"/>
-          <w:szCs w:val="20"/>
-        </w:rPr>
-        <w:t xml:space="preserve">F. Pedregosa et al., "Scikit-learn: Machine learning in Python," Journal of Machine Learning Research, vol. 12, pp. 2825–2830, 2011.</w:t>
-      </w:r>
-    </w:p>
-    <w:p>
-      <w:pPr>
-        <w:tabs>
-          <w:tab w:val="left" w:pos="480"/>
-        </w:tabs>
-        <w:spacing w:after="80"/>
-        <w:ind w:left="480" w:hanging="480"/>
-      </w:pPr>
-      <w:r>
-        <w:rPr>
-          <w:sz w:val="20"/>
-          <w:szCs w:val="20"/>
-        </w:rPr>
-        <w:t xml:space="preserve">[24]	</w:t>
-      </w:r>
-      <w:r>
-        <w:rPr>
-          <w:sz w:val="20"/>
-          <w:szCs w:val="20"/>
-        </w:rPr>
-        <w:t xml:space="preserve">H. Saied, "Multimodal reference subtraction, voiceprint and three-dimensional sound meter for drone localization," GitHub repository, 2026. https://github.com/husham-eng/Multimodal-Reference-Subtraction-Voiceprint-and-Three-Dimensional-Sound-Meter-for-Drone-Localization</w:t>
-      </w:r>
-    </w:p>
-    <w:p>
-      <w:pPr>
-        <w:pStyle w:val="Heading1"/>
-      </w:pPr>
-      <w:r>
-        <w:t xml:space="preserve">Appendix A: Source Code and Reproducibility</w:t>
-      </w:r>
-    </w:p>
-    <w:p>
-      <w:pPr>
-        <w:pStyle w:val="Heading2"/>
-      </w:pPr>
-      <w:r>
-        <w:t xml:space="preserve">A.1 Repository</w:t>
+        <w:t xml:space="preserve">Data and Code Availability</w:t>
       </w:r>
     </w:p>
     <w:p>
       <w:pPr>
         <w:spacing w:after="120"/>
-      </w:pPr>
-      <w:r>
-        <w:t xml:space="preserve">All Phase Two code, data download scripts, tests and figures are in the public repository </w:t>
-      </w:r>
-      <w:hyperlink w:history="1" r:id="rIdldumgb_g4rhv5mqgw9xjw">
+        <w:jc w:val="both"/>
+      </w:pPr>
+      <w:r>
+        <w:t xml:space="preserve">The source code, data download scripts, figures and this report are available in the GitHub repository </w:t>
+      </w:r>
+      <w:hyperlink w:history="1" r:id="rIdi-ze9hptghqf6wzobgu_s">
         <w:r>
           <w:rPr>
             <w:rStyle w:val="Hyperlink"/>
@@ -18381,7 +17964,647 @@
         </w:r>
       </w:hyperlink>
       <w:r>
-        <w:t xml:space="preserve"> (branch claude/epic-ride-9fqd2p) [24].</w:t>
+        <w:t xml:space="preserve"> [24] and are archived on Zenodo with the persistent identifier </w:t>
+      </w:r>
+      <w:hyperlink w:history="1" r:id="rIdlhbga4rcyxhe2yzgi-zwf">
+        <w:r>
+          <w:rPr>
+            <w:rStyle w:val="Hyperlink"/>
+          </w:rPr>
+          <w:t xml:space="preserve">10.5281/zenodo.XXXXXXX</w:t>
+        </w:r>
+      </w:hyperlink>
+      <w:r>
+        <w:t xml:space="preserve"> [25]. Each GitHub release is archived automatically as a new Zenodo version under the same concept DOI. The public datasets used for training are available from their original sources [9], [17]–[20]; they are not redistributed with the code.</w:t>
+      </w:r>
+    </w:p>
+    <w:p>
+      <w:pPr>
+        <w:pStyle w:val="Heading1"/>
+      </w:pPr>
+      <w:r>
+        <w:t xml:space="preserve">References</w:t>
+      </w:r>
+    </w:p>
+    <w:p>
+      <w:pPr>
+        <w:tabs>
+          <w:tab w:val="left" w:pos="480"/>
+        </w:tabs>
+        <w:spacing w:after="80"/>
+        <w:ind w:left="480" w:hanging="480"/>
+      </w:pPr>
+      <w:r>
+        <w:rPr>
+          <w:sz w:val="20"/>
+          <w:szCs w:val="20"/>
+        </w:rPr>
+        <w:t xml:space="preserve">[1]	</w:t>
+      </w:r>
+      <w:r>
+        <w:rPr>
+          <w:sz w:val="20"/>
+          <w:szCs w:val="20"/>
+        </w:rPr>
+        <w:t xml:space="preserve">C. H. Knapp and G. C. Carter, "The generalized correlation method for estimation of time delay," IEEE Trans. Acoustics, Speech, and Signal Processing, vol. 24, no. 4, pp. 320–327, 1976.</w:t>
+      </w:r>
+    </w:p>
+    <w:p>
+      <w:pPr>
+        <w:tabs>
+          <w:tab w:val="left" w:pos="480"/>
+        </w:tabs>
+        <w:spacing w:after="80"/>
+        <w:ind w:left="480" w:hanging="480"/>
+      </w:pPr>
+      <w:r>
+        <w:rPr>
+          <w:sz w:val="20"/>
+          <w:szCs w:val="20"/>
+        </w:rPr>
+        <w:t xml:space="preserve">[2]	</w:t>
+      </w:r>
+      <w:r>
+        <w:rPr>
+          <w:sz w:val="20"/>
+          <w:szCs w:val="20"/>
+        </w:rPr>
+        <w:t xml:space="preserve">R. O. Schmidt, "Multiple emitter location and signal parameter estimation," IEEE Trans. Antennas and Propagation, vol. 34, no. 3, pp. 276–280, 1986.</w:t>
+      </w:r>
+    </w:p>
+    <w:p>
+      <w:pPr>
+        <w:tabs>
+          <w:tab w:val="left" w:pos="480"/>
+        </w:tabs>
+        <w:spacing w:after="80"/>
+        <w:ind w:left="480" w:hanging="480"/>
+      </w:pPr>
+      <w:r>
+        <w:rPr>
+          <w:sz w:val="20"/>
+          <w:szCs w:val="20"/>
+        </w:rPr>
+        <w:t xml:space="preserve">[3]	</w:t>
+      </w:r>
+      <w:r>
+        <w:rPr>
+          <w:sz w:val="20"/>
+          <w:szCs w:val="20"/>
+        </w:rPr>
+        <w:t xml:space="preserve">J.-M. Valin, F. Michaud, J. Rouat, and D. Létourneau, "Robust sound source localization using a microphone array on a mobile robot," in Proc. IEEE/RSJ IROS, 2003.</w:t>
+      </w:r>
+    </w:p>
+    <w:p>
+      <w:pPr>
+        <w:tabs>
+          <w:tab w:val="left" w:pos="480"/>
+        </w:tabs>
+        <w:spacing w:after="80"/>
+        <w:ind w:left="480" w:hanging="480"/>
+      </w:pPr>
+      <w:r>
+        <w:rPr>
+          <w:sz w:val="20"/>
+          <w:szCs w:val="20"/>
+        </w:rPr>
+        <w:t xml:space="preserve">[4]	</w:t>
+      </w:r>
+      <w:r>
+        <w:rPr>
+          <w:sz w:val="20"/>
+          <w:szCs w:val="20"/>
+        </w:rPr>
+        <w:t xml:space="preserve">K. Nakadai, T. Takahashi, H. G. Okuno, H. Nakajima, Y. Hasegawa, and H. Tsujino, "Design and implementation of robot audition system 'HARK' — open source software for listening to three simultaneous speakers," Advanced Robotics, vol. 24, no. 5–6, pp. 739–761, 2010.</w:t>
+      </w:r>
+    </w:p>
+    <w:p>
+      <w:pPr>
+        <w:tabs>
+          <w:tab w:val="left" w:pos="480"/>
+        </w:tabs>
+        <w:spacing w:after="80"/>
+        <w:ind w:left="480" w:hanging="480"/>
+      </w:pPr>
+      <w:r>
+        <w:rPr>
+          <w:sz w:val="20"/>
+          <w:szCs w:val="20"/>
+        </w:rPr>
+        <w:t xml:space="preserve">[5]	</w:t>
+      </w:r>
+      <w:r>
+        <w:rPr>
+          <w:sz w:val="20"/>
+          <w:szCs w:val="20"/>
+        </w:rPr>
+        <w:t xml:space="preserve">M. Basiri, F. Schill, P. U. Lima, and D. Floreano, "Robust acoustic source localization of emergency signals from micro air vehicles," in Proc. IEEE/RSJ IROS, 2012.</w:t>
+      </w:r>
+    </w:p>
+    <w:p>
+      <w:pPr>
+        <w:tabs>
+          <w:tab w:val="left" w:pos="480"/>
+        </w:tabs>
+        <w:spacing w:after="80"/>
+        <w:ind w:left="480" w:hanging="480"/>
+      </w:pPr>
+      <w:r>
+        <w:rPr>
+          <w:sz w:val="20"/>
+          <w:szCs w:val="20"/>
+        </w:rPr>
+        <w:t xml:space="preserve">[6]	</w:t>
+      </w:r>
+      <w:r>
+        <w:rPr>
+          <w:sz w:val="20"/>
+          <w:szCs w:val="20"/>
+        </w:rPr>
+        <w:t xml:space="preserve">K. Furukawa, K. Okutani, K. Nagira, T. Otsuka, K. Itoyama, K. Nakadai, and H. G. Okuno, "Noise correlation matrix estimation for improving sound source localization by multirotor UAV," in Proc. IEEE/RSJ IROS, 2013.</w:t>
+      </w:r>
+    </w:p>
+    <w:p>
+      <w:pPr>
+        <w:tabs>
+          <w:tab w:val="left" w:pos="480"/>
+        </w:tabs>
+        <w:spacing w:after="80"/>
+        <w:ind w:left="480" w:hanging="480"/>
+      </w:pPr>
+      <w:r>
+        <w:rPr>
+          <w:sz w:val="20"/>
+          <w:szCs w:val="20"/>
+        </w:rPr>
+        <w:t xml:space="preserve">[7]	</w:t>
+      </w:r>
+      <w:r>
+        <w:rPr>
+          <w:sz w:val="20"/>
+          <w:szCs w:val="20"/>
+        </w:rPr>
+        <w:t xml:space="preserve">L. Wang and A. Cavallaro, "Ear in the sky: Ego-noise reduction for auditory micro aerial vehicles," in Proc. IEEE AVSS, 2016.</w:t>
+      </w:r>
+    </w:p>
+    <w:p>
+      <w:pPr>
+        <w:tabs>
+          <w:tab w:val="left" w:pos="480"/>
+        </w:tabs>
+        <w:spacing w:after="80"/>
+        <w:ind w:left="480" w:hanging="480"/>
+      </w:pPr>
+      <w:r>
+        <w:rPr>
+          <w:sz w:val="20"/>
+          <w:szCs w:val="20"/>
+        </w:rPr>
+        <w:t xml:space="preserve">[8]	</w:t>
+      </w:r>
+      <w:r>
+        <w:rPr>
+          <w:sz w:val="20"/>
+          <w:szCs w:val="20"/>
+        </w:rPr>
+        <w:t xml:space="preserve">Y. Hioka, M. Kingan, G. Schmid, and K. A. Stol, "Speech enhancement using a microphone array mounted on an unmanned aerial vehicle," in Proc. IWAENC, 2016.</w:t>
+      </w:r>
+    </w:p>
+    <w:p>
+      <w:pPr>
+        <w:tabs>
+          <w:tab w:val="left" w:pos="480"/>
+        </w:tabs>
+        <w:spacing w:after="80"/>
+        <w:ind w:left="480" w:hanging="480"/>
+      </w:pPr>
+      <w:r>
+        <w:rPr>
+          <w:sz w:val="20"/>
+          <w:szCs w:val="20"/>
+        </w:rPr>
+        <w:t xml:space="preserve">[9]	</w:t>
+      </w:r>
+      <w:r>
+        <w:rPr>
+          <w:sz w:val="20"/>
+          <w:szCs w:val="20"/>
+        </w:rPr>
+        <w:t xml:space="preserve">M. Strauss, P. Mordel, V. Miguet, and A. Deleforge, "DREGON: Dataset and methods for UAV-embedded sound source localization," in Proc. IEEE/RSJ IROS, 2018. Data: http://dregon.inria.fr</w:t>
+      </w:r>
+    </w:p>
+    <w:p>
+      <w:pPr>
+        <w:tabs>
+          <w:tab w:val="left" w:pos="480"/>
+        </w:tabs>
+        <w:spacing w:after="80"/>
+        <w:ind w:left="480" w:hanging="480"/>
+      </w:pPr>
+      <w:r>
+        <w:rPr>
+          <w:sz w:val="20"/>
+          <w:szCs w:val="20"/>
+        </w:rPr>
+        <w:t xml:space="preserve">[10]	</w:t>
+      </w:r>
+      <w:r>
+        <w:rPr>
+          <w:sz w:val="20"/>
+          <w:szCs w:val="20"/>
+        </w:rPr>
+        <w:t xml:space="preserve">S. F. Boll, "Suppression of acoustic noise in speech using spectral subtraction," IEEE Trans. Acoustics, Speech, and Signal Processing, vol. 27, no. 2, pp. 113–120, 1979.</w:t>
+      </w:r>
+    </w:p>
+    <w:p>
+      <w:pPr>
+        <w:tabs>
+          <w:tab w:val="left" w:pos="480"/>
+        </w:tabs>
+        <w:spacing w:after="80"/>
+        <w:ind w:left="480" w:hanging="480"/>
+      </w:pPr>
+      <w:r>
+        <w:rPr>
+          <w:sz w:val="20"/>
+          <w:szCs w:val="20"/>
+        </w:rPr>
+        <w:t xml:space="preserve">[11]	</w:t>
+      </w:r>
+      <w:r>
+        <w:rPr>
+          <w:sz w:val="20"/>
+          <w:szCs w:val="20"/>
+        </w:rPr>
+        <w:t xml:space="preserve">B. Widrow et al., "Adaptive noise cancelling: Principles and applications," Proceedings of the IEEE, vol. 63, no. 12, pp. 1692–1716, 1975.</w:t>
+      </w:r>
+    </w:p>
+    <w:p>
+      <w:pPr>
+        <w:tabs>
+          <w:tab w:val="left" w:pos="480"/>
+        </w:tabs>
+        <w:spacing w:after="80"/>
+        <w:ind w:left="480" w:hanging="480"/>
+      </w:pPr>
+      <w:r>
+        <w:rPr>
+          <w:sz w:val="20"/>
+          <w:szCs w:val="20"/>
+        </w:rPr>
+        <w:t xml:space="preserve">[12]	</w:t>
+      </w:r>
+      <w:r>
+        <w:rPr>
+          <w:sz w:val="20"/>
+          <w:szCs w:val="20"/>
+        </w:rPr>
+        <w:t xml:space="preserve">R. E. Kalman, "A new approach to linear filtering and prediction problems," Journal of Basic Engineering, vol. 82, no. 1, pp. 35–45, 1960.</w:t>
+      </w:r>
+    </w:p>
+    <w:p>
+      <w:pPr>
+        <w:tabs>
+          <w:tab w:val="left" w:pos="480"/>
+        </w:tabs>
+        <w:spacing w:after="80"/>
+        <w:ind w:left="480" w:hanging="480"/>
+      </w:pPr>
+      <w:r>
+        <w:rPr>
+          <w:sz w:val="20"/>
+          <w:szCs w:val="20"/>
+        </w:rPr>
+        <w:t xml:space="preserve">[13]	</w:t>
+      </w:r>
+      <w:r>
+        <w:rPr>
+          <w:sz w:val="20"/>
+          <w:szCs w:val="20"/>
+        </w:rPr>
+        <w:t xml:space="preserve">Y. Bar-Shalom, X. R. Li, and T. Kirubarajan, Estimation with Applications to Tracking and Navigation. New York: Wiley, 2001.</w:t>
+      </w:r>
+    </w:p>
+    <w:p>
+      <w:pPr>
+        <w:tabs>
+          <w:tab w:val="left" w:pos="480"/>
+        </w:tabs>
+        <w:spacing w:after="80"/>
+        <w:ind w:left="480" w:hanging="480"/>
+      </w:pPr>
+      <w:r>
+        <w:rPr>
+          <w:sz w:val="20"/>
+          <w:szCs w:val="20"/>
+        </w:rPr>
+        <w:t xml:space="preserve">[14]	</w:t>
+      </w:r>
+      <w:r>
+        <w:rPr>
+          <w:sz w:val="20"/>
+          <w:szCs w:val="20"/>
+        </w:rPr>
+        <w:t xml:space="preserve">L. Meier, D. Honegger, and M. Pollefeys, "PX4: A node-based multithreaded open source robotics framework for deeply embedded platforms," in Proc. IEEE ICRA, 2015.</w:t>
+      </w:r>
+    </w:p>
+    <w:p>
+      <w:pPr>
+        <w:tabs>
+          <w:tab w:val="left" w:pos="480"/>
+        </w:tabs>
+        <w:spacing w:after="80"/>
+        <w:ind w:left="480" w:hanging="480"/>
+      </w:pPr>
+      <w:r>
+        <w:rPr>
+          <w:sz w:val="20"/>
+          <w:szCs w:val="20"/>
+        </w:rPr>
+        <w:t xml:space="preserve">[15]	</w:t>
+      </w:r>
+      <w:r>
+        <w:rPr>
+          <w:sz w:val="20"/>
+          <w:szCs w:val="20"/>
+        </w:rPr>
+        <w:t xml:space="preserve">E. Olson, "AprilTag: A robust and flexible visual fiducial system," in Proc. IEEE ICRA, 2011.</w:t>
+      </w:r>
+    </w:p>
+    <w:p>
+      <w:pPr>
+        <w:tabs>
+          <w:tab w:val="left" w:pos="480"/>
+        </w:tabs>
+        <w:spacing w:after="80"/>
+        <w:ind w:left="480" w:hanging="480"/>
+      </w:pPr>
+      <w:r>
+        <w:rPr>
+          <w:sz w:val="20"/>
+          <w:szCs w:val="20"/>
+        </w:rPr>
+        <w:t xml:space="preserve">[16]	</w:t>
+      </w:r>
+      <w:r>
+        <w:rPr>
+          <w:sz w:val="20"/>
+          <w:szCs w:val="20"/>
+        </w:rPr>
+        <w:t xml:space="preserve">K. A. O. Suzuki, P. Kemper Filho, and J. R. Morrison, "Automatic battery replacement system for UAVs: Analysis and design," Journal of Intelligent &amp; Robotic Systems, vol. 65, pp. 563–586, 2012.</w:t>
+      </w:r>
+    </w:p>
+    <w:p>
+      <w:pPr>
+        <w:tabs>
+          <w:tab w:val="left" w:pos="480"/>
+        </w:tabs>
+        <w:spacing w:after="80"/>
+        <w:ind w:left="480" w:hanging="480"/>
+      </w:pPr>
+      <w:r>
+        <w:rPr>
+          <w:sz w:val="20"/>
+          <w:szCs w:val="20"/>
+        </w:rPr>
+        <w:t xml:space="preserve">[17]	</w:t>
+      </w:r>
+      <w:r>
+        <w:rPr>
+          <w:sz w:val="20"/>
+          <w:szCs w:val="20"/>
+        </w:rPr>
+        <w:t xml:space="preserve">S. Al-Emadi, A. Al-Ali, A. Mohammad, and A. Al-Ali, "Audio based drone detection and identification using deep learning," in Proc. 15th Int. Wireless Communications &amp; Mobile Computing Conf. (IWCMC), 2019, pp. 459–464. Data: https://github.com/saraalemadi/DroneAudioDataset</w:t>
+      </w:r>
+    </w:p>
+    <w:p>
+      <w:pPr>
+        <w:tabs>
+          <w:tab w:val="left" w:pos="480"/>
+        </w:tabs>
+        <w:spacing w:after="80"/>
+        <w:ind w:left="480" w:hanging="480"/>
+      </w:pPr>
+      <w:r>
+        <w:rPr>
+          <w:sz w:val="20"/>
+          <w:szCs w:val="20"/>
+        </w:rPr>
+        <w:t xml:space="preserve">[18]	</w:t>
+      </w:r>
+      <w:r>
+        <w:rPr>
+          <w:sz w:val="20"/>
+          <w:szCs w:val="20"/>
+        </w:rPr>
+        <w:t xml:space="preserve">F. Svanström, F. Alonso-Fernandez, and C. Englund, "A dataset for multi-sensor drone detection," Data in Brief, vol. 39, 107521, 2021. Data: https://github.com/DroneDetectionThesis/Drone-detection-dataset</w:t>
+      </w:r>
+    </w:p>
+    <w:p>
+      <w:pPr>
+        <w:tabs>
+          <w:tab w:val="left" w:pos="480"/>
+        </w:tabs>
+        <w:spacing w:after="80"/>
+        <w:ind w:left="480" w:hanging="480"/>
+      </w:pPr>
+      <w:r>
+        <w:rPr>
+          <w:sz w:val="20"/>
+          <w:szCs w:val="20"/>
+        </w:rPr>
+        <w:t xml:space="preserve">[19]	</w:t>
+      </w:r>
+      <w:r>
+        <w:rPr>
+          <w:sz w:val="20"/>
+          <w:szCs w:val="20"/>
+        </w:rPr>
+        <w:t xml:space="preserve">K. J. Piczak, "ESC: Dataset for environmental sound classification," in Proc. 23rd ACM Int. Conf. on Multimedia, 2015, pp. 1015–1018. Data: https://github.com/karolpiczak/ESC-50</w:t>
+      </w:r>
+    </w:p>
+    <w:p>
+      <w:pPr>
+        <w:tabs>
+          <w:tab w:val="left" w:pos="480"/>
+        </w:tabs>
+        <w:spacing w:after="80"/>
+        <w:ind w:left="480" w:hanging="480"/>
+      </w:pPr>
+      <w:r>
+        <w:rPr>
+          <w:sz w:val="20"/>
+          <w:szCs w:val="20"/>
+        </w:rPr>
+        <w:t xml:space="preserve">[20]	</w:t>
+      </w:r>
+      <w:r>
+        <w:rPr>
+          <w:sz w:val="20"/>
+          <w:szCs w:val="20"/>
+        </w:rPr>
+        <w:t xml:space="preserve">A. Deleforge, D. Di Carlo, M. Strauss, R. Serizel, and L. Marcenaro, "Audio-based search and rescue with a drone: Highlights from the IEEE Signal Processing Cup 2019 student competition," IEEE Signal Processing Magazine, vol. 36, no. 5, pp. 138–144, 2019.</w:t>
+      </w:r>
+    </w:p>
+    <w:p>
+      <w:pPr>
+        <w:tabs>
+          <w:tab w:val="left" w:pos="480"/>
+        </w:tabs>
+        <w:spacing w:after="80"/>
+        <w:ind w:left="480" w:hanging="480"/>
+      </w:pPr>
+      <w:r>
+        <w:rPr>
+          <w:sz w:val="20"/>
+          <w:szCs w:val="20"/>
+        </w:rPr>
+        <w:t xml:space="preserve">[21]	</w:t>
+      </w:r>
+      <w:r>
+        <w:rPr>
+          <w:sz w:val="20"/>
+          <w:szCs w:val="20"/>
+        </w:rPr>
+        <w:t xml:space="preserve">J. H. DiBiase, H. F. Silverman, and M. S. Brandstein, "Robust localization in reverberant rooms," in Microphone Arrays: Signal Processing Techniques and Applications, M. Brandstein and D. Ward, Eds. Berlin: Springer, 2001, pp. 157–180.</w:t>
+      </w:r>
+    </w:p>
+    <w:p>
+      <w:pPr>
+        <w:tabs>
+          <w:tab w:val="left" w:pos="480"/>
+        </w:tabs>
+        <w:spacing w:after="80"/>
+        <w:ind w:left="480" w:hanging="480"/>
+      </w:pPr>
+      <w:r>
+        <w:rPr>
+          <w:sz w:val="20"/>
+          <w:szCs w:val="20"/>
+        </w:rPr>
+        <w:t xml:space="preserve">[22]	</w:t>
+      </w:r>
+      <w:r>
+        <w:rPr>
+          <w:sz w:val="20"/>
+          <w:szCs w:val="20"/>
+        </w:rPr>
+        <w:t xml:space="preserve">L. Breiman, "Random forests," Machine Learning, vol. 45, no. 1, pp. 5–32, 2001.</w:t>
+      </w:r>
+    </w:p>
+    <w:p>
+      <w:pPr>
+        <w:tabs>
+          <w:tab w:val="left" w:pos="480"/>
+        </w:tabs>
+        <w:spacing w:after="80"/>
+        <w:ind w:left="480" w:hanging="480"/>
+      </w:pPr>
+      <w:r>
+        <w:rPr>
+          <w:sz w:val="20"/>
+          <w:szCs w:val="20"/>
+        </w:rPr>
+        <w:t xml:space="preserve">[23]	</w:t>
+      </w:r>
+      <w:r>
+        <w:rPr>
+          <w:sz w:val="20"/>
+          <w:szCs w:val="20"/>
+        </w:rPr>
+        <w:t xml:space="preserve">F. Pedregosa et al., "Scikit-learn: Machine learning in Python," Journal of Machine Learning Research, vol. 12, pp. 2825–2830, 2011.</w:t>
+      </w:r>
+    </w:p>
+    <w:p>
+      <w:pPr>
+        <w:tabs>
+          <w:tab w:val="left" w:pos="480"/>
+        </w:tabs>
+        <w:spacing w:after="80"/>
+        <w:ind w:left="480" w:hanging="480"/>
+      </w:pPr>
+      <w:r>
+        <w:rPr>
+          <w:sz w:val="20"/>
+          <w:szCs w:val="20"/>
+        </w:rPr>
+        <w:t xml:space="preserve">[24]	</w:t>
+      </w:r>
+      <w:r>
+        <w:rPr>
+          <w:sz w:val="20"/>
+          <w:szCs w:val="20"/>
+        </w:rPr>
+        <w:t xml:space="preserve">H. Saied, "Multimodal reference subtraction, voiceprint and three-dimensional sound meter for drone localization," GitHub repository, 2026. https://github.com/husham-eng/Multimodal-Reference-Subtraction-Voiceprint-and-Three-Dimensional-Sound-Meter-for-Drone-Localization</w:t>
+      </w:r>
+    </w:p>
+    <w:p>
+      <w:pPr>
+        <w:tabs>
+          <w:tab w:val="left" w:pos="480"/>
+        </w:tabs>
+        <w:spacing w:after="80"/>
+        <w:ind w:left="480" w:hanging="480"/>
+      </w:pPr>
+      <w:r>
+        <w:rPr>
+          <w:sz w:val="20"/>
+          <w:szCs w:val="20"/>
+        </w:rPr>
+        <w:t xml:space="preserve">[25]	</w:t>
+      </w:r>
+      <w:r>
+        <w:rPr>
+          <w:sz w:val="20"/>
+          <w:szCs w:val="20"/>
+        </w:rPr>
+        <w:t xml:space="preserve">H. Saied, "Multimodal Reference Subtraction, Drone Voiceprint and Three-Dimensional Sound Meter for Drone Localization" (software and report, version 2.0.0), Zenodo, 2026. doi: 10.5281/zenodo.XXXXXXX. https://doi.org/10.5281/zenodo.XXXXXXX</w:t>
+      </w:r>
+    </w:p>
+    <w:p>
+      <w:pPr>
+        <w:pStyle w:val="Heading1"/>
+      </w:pPr>
+      <w:r>
+        <w:t xml:space="preserve">Appendix A: Source Code and Reproducibility</w:t>
+      </w:r>
+    </w:p>
+    <w:p>
+      <w:pPr>
+        <w:pStyle w:val="Heading2"/>
+      </w:pPr>
+      <w:r>
+        <w:t xml:space="preserve">A.1 Repository</w:t>
+      </w:r>
+    </w:p>
+    <w:p>
+      <w:pPr>
+        <w:spacing w:after="120"/>
+      </w:pPr>
+      <w:r>
+        <w:t xml:space="preserve">All Phase Two code, data download scripts, tests and figures are in the public repository </w:t>
+      </w:r>
+      <w:hyperlink w:history="1" r:id="rIdmqemdmopuskw8_jyxgzdt">
+        <w:r>
+          <w:rPr>
+            <w:rStyle w:val="Hyperlink"/>
+          </w:rPr>
+          <w:t xml:space="preserve">https://github.com/husham-eng/Multimodal-Reference-Subtraction-Voiceprint-and-Three-Dimensional-Sound-Meter-for-Drone-Localization</w:t>
+        </w:r>
+      </w:hyperlink>
+      <w:r>
+        <w:t xml:space="preserve"> (branch claude/epic-ride-9fqd2p) [24], archived on Zenodo as </w:t>
+      </w:r>
+      <w:hyperlink w:history="1" r:id="rId14j6javeq-nhdrg8ojpqu">
+        <w:r>
+          <w:rPr>
+            <w:rStyle w:val="Hyperlink"/>
+          </w:rPr>
+          <w:t xml:space="preserve">10.5281/zenodo.XXXXXXX</w:t>
+        </w:r>
+      </w:hyperlink>
+      <w:r>
+        <w:t xml:space="preserve"> [25]. The files CITATION.cff and .zenodo.json in the repository hold the citation and archive metadata.</w:t>
       </w:r>
     </w:p>
     <w:p>

</xml_diff>

<commit_message>
Add Zenodo DOIs to report, README and citation file
Co-Authored-By: Claude Opus 5.5 <noreply@anthropic.com>
Claude-Session: https://claude.ai/code/session_01Tjp7tKuW9QND1aAEqAWhGA
</commit_message>
<xml_diff>
--- a/docs/Drone_Acoustic_Guidance_Report_EN_v2.docx
+++ b/docs/Drone_Acoustic_Guidance_Report_EN_v2.docx
@@ -106,7 +106,7 @@
         <w:spacing w:after="60"/>
         <w:jc w:val="center"/>
       </w:pPr>
-      <w:hyperlink w:history="1" r:id="rIdgbenm3u0vr7c_vupmyhrh">
+      <w:hyperlink w:history="1" r:id="rIdob0nzunswrrkkcywji4px">
         <w:r>
           <w:rPr>
             <w:rStyle w:val="Hyperlink"/>
@@ -126,7 +126,7 @@
           <w:sz w:val="20"/>
           <w:szCs w:val="20"/>
         </w:rPr>
-        <w:t xml:space="preserve">(branch: claude/epic-ride-9fqd2p)</w:t>
+        <w:t xml:space="preserve">(branch: main)</w:t>
       </w:r>
     </w:p>
     <w:p>
@@ -140,19 +140,41 @@
           <w:sz w:val="20"/>
           <w:szCs w:val="20"/>
         </w:rPr>
-        <w:t xml:space="preserve">Archived on Zenodo:</w:t>
-      </w:r>
-    </w:p>
-    <w:p>
-      <w:pPr>
+        <w:t xml:space="preserve">Archived on Zenodo (cite all versions):</w:t>
+      </w:r>
+    </w:p>
+    <w:p>
+      <w:pPr>
+        <w:spacing w:after="40"/>
         <w:jc w:val="center"/>
       </w:pPr>
-      <w:hyperlink w:history="1" r:id="rIdut_plov23bipkbue_y9im">
+      <w:hyperlink w:history="1" r:id="rIdskzjv8de6da613xqltm_k">
         <w:r>
           <w:rPr>
             <w:rStyle w:val="Hyperlink"/>
           </w:rPr>
-          <w:t xml:space="preserve">DOI: 10.5281/zenodo.XXXXXXX</w:t>
+          <w:t xml:space="preserve">DOI: 10.5281/zenodo.23122228</w:t>
+        </w:r>
+      </w:hyperlink>
+    </w:p>
+    <w:p>
+      <w:pPr>
+        <w:jc w:val="center"/>
+      </w:pPr>
+      <w:r>
+        <w:rPr>
+          <w:color w:val="595959"/>
+          <w:sz w:val="20"/>
+          <w:szCs w:val="20"/>
+        </w:rPr>
+        <w:t xml:space="preserve">Version 2.0.0: </w:t>
+      </w:r>
+      <w:hyperlink w:history="1" r:id="rIdkibvnfg2jthovdb8hdosa">
+        <w:r>
+          <w:rPr>
+            <w:rStyle w:val="Hyperlink"/>
+          </w:rPr>
+          <w:t xml:space="preserve">DOI: 10.5281/zenodo.23122229</w:t>
         </w:r>
       </w:hyperlink>
     </w:p>
@@ -17955,7 +17977,7 @@
       <w:r>
         <w:t xml:space="preserve">The source code, data download scripts, figures and this report are available in the GitHub repository </w:t>
       </w:r>
-      <w:hyperlink w:history="1" r:id="rIdi-ze9hptghqf6wzobgu_s">
+      <w:hyperlink w:history="1" r:id="rIdczgj4zbkoyfvx2thb3ck6">
         <w:r>
           <w:rPr>
             <w:rStyle w:val="Hyperlink"/>
@@ -17966,16 +17988,27 @@
       <w:r>
         <w:t xml:space="preserve"> [24] and are archived on Zenodo with the persistent identifier </w:t>
       </w:r>
-      <w:hyperlink w:history="1" r:id="rIdlhbga4rcyxhe2yzgi-zwf">
+      <w:hyperlink w:history="1" r:id="rIduqmxxtkx6qlhhwruxxmuh">
         <w:r>
           <w:rPr>
             <w:rStyle w:val="Hyperlink"/>
           </w:rPr>
-          <w:t xml:space="preserve">10.5281/zenodo.XXXXXXX</w:t>
+          <w:t xml:space="preserve">10.5281/zenodo.23122228</w:t>
         </w:r>
       </w:hyperlink>
       <w:r>
-        <w:t xml:space="preserve"> [25]. Each GitHub release is archived automatically as a new Zenodo version under the same concept DOI. The public datasets used for training are available from their original sources [9], [17]–[20]; they are not redistributed with the code.</w:t>
+        <w:t xml:space="preserve"> (concept DOI, all versions) [25]; the version described in this report (v2.0.0) is </w:t>
+      </w:r>
+      <w:hyperlink w:history="1" r:id="rIdeuy499vt_gvvfny0j2-27">
+        <w:r>
+          <w:rPr>
+            <w:rStyle w:val="Hyperlink"/>
+          </w:rPr>
+          <w:t xml:space="preserve">10.5281/zenodo.23122229</w:t>
+        </w:r>
+      </w:hyperlink>
+      <w:r>
+        <w:t xml:space="preserve">. Each GitHub release is archived automatically as a new Zenodo version under the same concept DOI. The public datasets used for training are available from their original sources [9], [17]–[20]; they are not redistributed with the code.</w:t>
       </w:r>
     </w:p>
     <w:p>
@@ -18558,7 +18591,7 @@
           <w:sz w:val="20"/>
           <w:szCs w:val="20"/>
         </w:rPr>
-        <w:t xml:space="preserve">H. Saied, "Multimodal Reference Subtraction, Drone Voiceprint and Three-Dimensional Sound Meter for Drone Localization" (software and report, version 2.0.0), Zenodo, 2026. doi: 10.5281/zenodo.XXXXXXX. https://doi.org/10.5281/zenodo.XXXXXXX</w:t>
+        <w:t xml:space="preserve">H. Saied, "Multimodal Reference Subtraction, Drone Voiceprint and Three-Dimensional Sound Meter for Drone Localization" (software and report, version 2.0.0), Zenodo, 2026. doi: 10.5281/zenodo.23122228 (all versions); version 2.0.0: doi: 10.5281/zenodo.23122229. https://doi.org/10.5281/zenodo.23122228</w:t>
       </w:r>
     </w:p>
     <w:p>
@@ -18584,7 +18617,7 @@
       <w:r>
         <w:t xml:space="preserve">All Phase Two code, data download scripts, tests and figures are in the public repository </w:t>
       </w:r>
-      <w:hyperlink w:history="1" r:id="rIdmqemdmopuskw8_jyxgzdt">
+      <w:hyperlink w:history="1" r:id="rIdvbqydh3_jcyc275oluhhv">
         <w:r>
           <w:rPr>
             <w:rStyle w:val="Hyperlink"/>
@@ -18593,14 +18626,14 @@
         </w:r>
       </w:hyperlink>
       <w:r>
-        <w:t xml:space="preserve"> (branch claude/epic-ride-9fqd2p) [24], archived on Zenodo as </w:t>
-      </w:r>
-      <w:hyperlink w:history="1" r:id="rId14j6javeq-nhdrg8ojpqu">
+        <w:t xml:space="preserve"> (branch main) [24], archived on Zenodo as </w:t>
+      </w:r>
+      <w:hyperlink w:history="1" r:id="rIdcyoafg398ob-keyqdehp5">
         <w:r>
           <w:rPr>
             <w:rStyle w:val="Hyperlink"/>
           </w:rPr>
-          <w:t xml:space="preserve">10.5281/zenodo.XXXXXXX</w:t>
+          <w:t xml:space="preserve">10.5281/zenodo.23122228</w:t>
         </w:r>
       </w:hyperlink>
       <w:r>

</xml_diff>

<commit_message>
Update report: affiliation, document history, release v2.0.0 and identifiers
Co-Authored-By: Claude Opus 5.5 <noreply@anthropic.com>
Claude-Session: https://claude.ai/code/session_01Tjp7tKuW9QND1aAEqAWhGA
</commit_message>
<xml_diff>
--- a/docs/Drone_Acoustic_Guidance_Report_EN_v2.docx
+++ b/docs/Drone_Acoustic_Guidance_Report_EN_v2.docx
@@ -76,6 +76,20 @@
     </w:p>
     <w:p>
       <w:pPr>
+        <w:spacing w:after="80"/>
+        <w:jc w:val="center"/>
+      </w:pPr>
+      <w:r>
+        <w:rPr>
+          <w:color w:val="595959"/>
+          <w:sz w:val="22"/>
+          <w:szCs w:val="22"/>
+        </w:rPr>
+        <w:t xml:space="preserve">Prince Sultan Military College of Health</w:t>
+      </w:r>
+    </w:p>
+    <w:p>
+      <w:pPr>
         <w:spacing w:after="400"/>
         <w:jc w:val="center"/>
       </w:pPr>
@@ -106,7 +120,7 @@
         <w:spacing w:after="60"/>
         <w:jc w:val="center"/>
       </w:pPr>
-      <w:hyperlink w:history="1" r:id="rIdob0nzunswrrkkcywji4px">
+      <w:hyperlink w:history="1" r:id="rIdayq4tao9oi0cpptmb3shb">
         <w:r>
           <w:rPr>
             <w:rStyle w:val="Hyperlink"/>
@@ -148,7 +162,7 @@
         <w:spacing w:after="40"/>
         <w:jc w:val="center"/>
       </w:pPr>
-      <w:hyperlink w:history="1" r:id="rIdskzjv8de6da613xqltm_k">
+      <w:hyperlink w:history="1" r:id="rIdzicvfh-fxakabx3umvbn7">
         <w:r>
           <w:rPr>
             <w:rStyle w:val="Hyperlink"/>
@@ -169,7 +183,7 @@
         </w:rPr>
         <w:t xml:space="preserve">Version 2.0.0: </w:t>
       </w:r>
-      <w:hyperlink w:history="1" r:id="rIdkibvnfg2jthovdb8hdosa">
+      <w:hyperlink w:history="1" r:id="rIdd1sc2a0mxsg2qep29yfa4">
         <w:r>
           <w:rPr>
             <w:rStyle w:val="Hyperlink"/>
@@ -229,6 +243,418 @@
         <w:t xml:space="preserve">(Right-click the table of contents and choose “Update Field” if page numbers are not shown.)</w:t>
       </w:r>
     </w:p>
+    <w:p>
+      <w:r>
+        <w:br w:type="page"/>
+      </w:r>
+    </w:p>
+    <w:p>
+      <w:pPr>
+        <w:spacing w:after="160"/>
+      </w:pPr>
+      <w:r>
+        <w:rPr>
+          <w:b/>
+          <w:bCs/>
+          <w:color w:val="1F3864"/>
+          <w:sz w:val="28"/>
+          <w:szCs w:val="28"/>
+        </w:rPr>
+        <w:t xml:space="preserve">Document History</w:t>
+      </w:r>
+    </w:p>
+    <w:tbl>
+      <w:tblPr>
+        <w:tblW w:type="dxa" w:w="9070"/>
+        <w:tblBorders>
+          <w:top w:val="single" w:color="auto" w:sz="4"/>
+          <w:left w:val="single" w:color="auto" w:sz="4"/>
+          <w:bottom w:val="single" w:color="auto" w:sz="4"/>
+          <w:right w:val="single" w:color="auto" w:sz="4"/>
+          <w:insideH w:val="single" w:color="auto" w:sz="4"/>
+          <w:insideV w:val="single" w:color="auto" w:sz="4"/>
+        </w:tblBorders>
+      </w:tblPr>
+      <w:tblGrid>
+        <w:gridCol w:w="1100"/>
+        <w:gridCol w:w="1600"/>
+        <w:gridCol w:w="4170"/>
+        <w:gridCol w:w="2200"/>
+      </w:tblGrid>
+      <w:tr>
+        <w:trPr>
+          <w:tblHeader/>
+        </w:trPr>
+        <w:tc>
+          <w:tcPr>
+            <w:tcW w:type="dxa" w:w="1100"/>
+            <w:tcBorders>
+              <w:top w:val="single" w:color="A6A6A6" w:sz="4"/>
+              <w:left w:val="single" w:color="A6A6A6" w:sz="4"/>
+              <w:bottom w:val="single" w:color="A6A6A6" w:sz="4"/>
+              <w:right w:val="single" w:color="A6A6A6" w:sz="4"/>
+            </w:tcBorders>
+            <w:shd w:fill="DCE3F0" w:color="auto" w:val="clear"/>
+            <w:tcMar>
+              <w:top w:type="dxa" w:w="50"/>
+              <w:left w:type="dxa" w:w="90"/>
+              <w:bottom w:type="dxa" w:w="50"/>
+              <w:right w:type="dxa" w:w="90"/>
+            </w:tcMar>
+          </w:tcPr>
+          <w:p>
+            <w:pPr>
+              <w:jc w:val="left"/>
+            </w:pPr>
+            <w:r>
+              <w:rPr>
+                <w:b/>
+                <w:bCs/>
+                <w:sz w:val="19"/>
+                <w:szCs w:val="19"/>
+              </w:rPr>
+              <w:t xml:space="preserve">Revision</w:t>
+            </w:r>
+          </w:p>
+        </w:tc>
+        <w:tc>
+          <w:tcPr>
+            <w:tcW w:type="dxa" w:w="1600"/>
+            <w:tcBorders>
+              <w:top w:val="single" w:color="A6A6A6" w:sz="4"/>
+              <w:left w:val="single" w:color="A6A6A6" w:sz="4"/>
+              <w:bottom w:val="single" w:color="A6A6A6" w:sz="4"/>
+              <w:right w:val="single" w:color="A6A6A6" w:sz="4"/>
+            </w:tcBorders>
+            <w:shd w:fill="DCE3F0" w:color="auto" w:val="clear"/>
+            <w:tcMar>
+              <w:top w:type="dxa" w:w="50"/>
+              <w:left w:type="dxa" w:w="90"/>
+              <w:bottom w:type="dxa" w:w="50"/>
+              <w:right w:type="dxa" w:w="90"/>
+            </w:tcMar>
+          </w:tcPr>
+          <w:p>
+            <w:pPr>
+              <w:jc w:val="left"/>
+            </w:pPr>
+            <w:r>
+              <w:rPr>
+                <w:b/>
+                <w:bCs/>
+                <w:sz w:val="19"/>
+                <w:szCs w:val="19"/>
+              </w:rPr>
+              <w:t xml:space="preserve">Date</w:t>
+            </w:r>
+          </w:p>
+        </w:tc>
+        <w:tc>
+          <w:tcPr>
+            <w:tcW w:type="dxa" w:w="4170"/>
+            <w:tcBorders>
+              <w:top w:val="single" w:color="A6A6A6" w:sz="4"/>
+              <w:left w:val="single" w:color="A6A6A6" w:sz="4"/>
+              <w:bottom w:val="single" w:color="A6A6A6" w:sz="4"/>
+              <w:right w:val="single" w:color="A6A6A6" w:sz="4"/>
+            </w:tcBorders>
+            <w:shd w:fill="DCE3F0" w:color="auto" w:val="clear"/>
+            <w:tcMar>
+              <w:top w:type="dxa" w:w="50"/>
+              <w:left w:type="dxa" w:w="90"/>
+              <w:bottom w:type="dxa" w:w="50"/>
+              <w:right w:type="dxa" w:w="90"/>
+            </w:tcMar>
+          </w:tcPr>
+          <w:p>
+            <w:pPr>
+              <w:jc w:val="left"/>
+            </w:pPr>
+            <w:r>
+              <w:rPr>
+                <w:b/>
+                <w:bCs/>
+                <w:sz w:val="19"/>
+                <w:szCs w:val="19"/>
+              </w:rPr>
+              <w:t xml:space="preserve">Content</w:t>
+            </w:r>
+          </w:p>
+        </w:tc>
+        <w:tc>
+          <w:tcPr>
+            <w:tcW w:type="dxa" w:w="2200"/>
+            <w:tcBorders>
+              <w:top w:val="single" w:color="A6A6A6" w:sz="4"/>
+              <w:left w:val="single" w:color="A6A6A6" w:sz="4"/>
+              <w:bottom w:val="single" w:color="A6A6A6" w:sz="4"/>
+              <w:right w:val="single" w:color="A6A6A6" w:sz="4"/>
+            </w:tcBorders>
+            <w:shd w:fill="DCE3F0" w:color="auto" w:val="clear"/>
+            <w:tcMar>
+              <w:top w:type="dxa" w:w="50"/>
+              <w:left w:type="dxa" w:w="90"/>
+              <w:bottom w:type="dxa" w:w="50"/>
+              <w:right w:type="dxa" w:w="90"/>
+            </w:tcMar>
+          </w:tcPr>
+          <w:p>
+            <w:pPr>
+              <w:jc w:val="left"/>
+            </w:pPr>
+            <w:r>
+              <w:rPr>
+                <w:b/>
+                <w:bCs/>
+                <w:sz w:val="19"/>
+                <w:szCs w:val="19"/>
+              </w:rPr>
+              <w:t xml:space="preserve">Software release</w:t>
+            </w:r>
+          </w:p>
+        </w:tc>
+      </w:tr>
+      <w:tr>
+        <w:tc>
+          <w:tcPr>
+            <w:tcW w:type="dxa" w:w="1100"/>
+            <w:tcBorders>
+              <w:top w:val="single" w:color="A6A6A6" w:sz="4"/>
+              <w:left w:val="single" w:color="A6A6A6" w:sz="4"/>
+              <w:bottom w:val="single" w:color="A6A6A6" w:sz="4"/>
+              <w:right w:val="single" w:color="A6A6A6" w:sz="4"/>
+            </w:tcBorders>
+            <w:tcMar>
+              <w:top w:type="dxa" w:w="50"/>
+              <w:left w:type="dxa" w:w="90"/>
+              <w:bottom w:type="dxa" w:w="50"/>
+              <w:right w:type="dxa" w:w="90"/>
+            </w:tcMar>
+          </w:tcPr>
+          <w:p>
+            <w:pPr>
+              <w:jc w:val="left"/>
+            </w:pPr>
+            <w:r>
+              <w:rPr>
+                <w:sz w:val="19"/>
+                <w:szCs w:val="19"/>
+              </w:rPr>
+              <w:t xml:space="preserve">1</w:t>
+            </w:r>
+          </w:p>
+        </w:tc>
+        <w:tc>
+          <w:tcPr>
+            <w:tcW w:type="dxa" w:w="1600"/>
+            <w:tcBorders>
+              <w:top w:val="single" w:color="A6A6A6" w:sz="4"/>
+              <w:left w:val="single" w:color="A6A6A6" w:sz="4"/>
+              <w:bottom w:val="single" w:color="A6A6A6" w:sz="4"/>
+              <w:right w:val="single" w:color="A6A6A6" w:sz="4"/>
+            </w:tcBorders>
+            <w:tcMar>
+              <w:top w:type="dxa" w:w="50"/>
+              <w:left w:type="dxa" w:w="90"/>
+              <w:bottom w:type="dxa" w:w="50"/>
+              <w:right w:type="dxa" w:w="90"/>
+            </w:tcMar>
+          </w:tcPr>
+          <w:p>
+            <w:pPr>
+              <w:jc w:val="left"/>
+            </w:pPr>
+            <w:r>
+              <w:rPr>
+                <w:sz w:val="19"/>
+                <w:szCs w:val="19"/>
+              </w:rPr>
+              <w:t xml:space="preserve">October 2026</w:t>
+            </w:r>
+          </w:p>
+        </w:tc>
+        <w:tc>
+          <w:tcPr>
+            <w:tcW w:type="dxa" w:w="4170"/>
+            <w:tcBorders>
+              <w:top w:val="single" w:color="A6A6A6" w:sz="4"/>
+              <w:left w:val="single" w:color="A6A6A6" w:sz="4"/>
+              <w:bottom w:val="single" w:color="A6A6A6" w:sz="4"/>
+              <w:right w:val="single" w:color="A6A6A6" w:sz="4"/>
+            </w:tcBorders>
+            <w:tcMar>
+              <w:top w:type="dxa" w:w="50"/>
+              <w:left w:type="dxa" w:w="90"/>
+              <w:bottom w:type="dxa" w:w="50"/>
+              <w:right w:type="dxa" w:w="90"/>
+            </w:tcMar>
+          </w:tcPr>
+          <w:p>
+            <w:pPr>
+              <w:jc w:val="left"/>
+            </w:pPr>
+            <w:r>
+              <w:rPr>
+                <w:sz w:val="19"/>
+                <w:szCs w:val="19"/>
+              </w:rPr>
+              <w:t xml:space="preserve">Phase One report: beacon homing with rotor silence windows (simulation)</w:t>
+            </w:r>
+          </w:p>
+        </w:tc>
+        <w:tc>
+          <w:tcPr>
+            <w:tcW w:type="dxa" w:w="2200"/>
+            <w:tcBorders>
+              <w:top w:val="single" w:color="A6A6A6" w:sz="4"/>
+              <w:left w:val="single" w:color="A6A6A6" w:sz="4"/>
+              <w:bottom w:val="single" w:color="A6A6A6" w:sz="4"/>
+              <w:right w:val="single" w:color="A6A6A6" w:sz="4"/>
+            </w:tcBorders>
+            <w:tcMar>
+              <w:top w:type="dxa" w:w="50"/>
+              <w:left w:type="dxa" w:w="90"/>
+              <w:bottom w:type="dxa" w:w="50"/>
+              <w:right w:type="dxa" w:w="90"/>
+            </w:tcMar>
+          </w:tcPr>
+          <w:p>
+            <w:pPr>
+              <w:jc w:val="left"/>
+            </w:pPr>
+            <w:r>
+              <w:rPr>
+                <w:sz w:val="19"/>
+                <w:szCs w:val="19"/>
+              </w:rPr>
+              <w:t xml:space="preserve">Phase One scripts (not archived)</w:t>
+            </w:r>
+          </w:p>
+        </w:tc>
+      </w:tr>
+      <w:tr>
+        <w:tc>
+          <w:tcPr>
+            <w:tcW w:type="dxa" w:w="1100"/>
+            <w:tcBorders>
+              <w:top w:val="single" w:color="A6A6A6" w:sz="4"/>
+              <w:left w:val="single" w:color="A6A6A6" w:sz="4"/>
+              <w:bottom w:val="single" w:color="A6A6A6" w:sz="4"/>
+              <w:right w:val="single" w:color="A6A6A6" w:sz="4"/>
+            </w:tcBorders>
+            <w:shd w:fill="F5F7FB" w:color="auto" w:val="clear"/>
+            <w:tcMar>
+              <w:top w:type="dxa" w:w="50"/>
+              <w:left w:type="dxa" w:w="90"/>
+              <w:bottom w:type="dxa" w:w="50"/>
+              <w:right w:type="dxa" w:w="90"/>
+            </w:tcMar>
+          </w:tcPr>
+          <w:p>
+            <w:pPr>
+              <w:jc w:val="left"/>
+            </w:pPr>
+            <w:r>
+              <w:rPr>
+                <w:sz w:val="19"/>
+                <w:szCs w:val="19"/>
+              </w:rPr>
+              <w:t xml:space="preserve">2</w:t>
+            </w:r>
+          </w:p>
+        </w:tc>
+        <w:tc>
+          <w:tcPr>
+            <w:tcW w:type="dxa" w:w="1600"/>
+            <w:tcBorders>
+              <w:top w:val="single" w:color="A6A6A6" w:sz="4"/>
+              <w:left w:val="single" w:color="A6A6A6" w:sz="4"/>
+              <w:bottom w:val="single" w:color="A6A6A6" w:sz="4"/>
+              <w:right w:val="single" w:color="A6A6A6" w:sz="4"/>
+            </w:tcBorders>
+            <w:shd w:fill="F5F7FB" w:color="auto" w:val="clear"/>
+            <w:tcMar>
+              <w:top w:type="dxa" w:w="50"/>
+              <w:left w:type="dxa" w:w="90"/>
+              <w:bottom w:type="dxa" w:w="50"/>
+              <w:right w:type="dxa" w:w="90"/>
+            </w:tcMar>
+          </w:tcPr>
+          <w:p>
+            <w:pPr>
+              <w:jc w:val="left"/>
+            </w:pPr>
+            <w:r>
+              <w:rPr>
+                <w:sz w:val="19"/>
+                <w:szCs w:val="19"/>
+              </w:rPr>
+              <w:t xml:space="preserve">October 3, 2026</w:t>
+            </w:r>
+          </w:p>
+        </w:tc>
+        <w:tc>
+          <w:tcPr>
+            <w:tcW w:type="dxa" w:w="4170"/>
+            <w:tcBorders>
+              <w:top w:val="single" w:color="A6A6A6" w:sz="4"/>
+              <w:left w:val="single" w:color="A6A6A6" w:sz="4"/>
+              <w:bottom w:val="single" w:color="A6A6A6" w:sz="4"/>
+              <w:right w:val="single" w:color="A6A6A6" w:sz="4"/>
+            </w:tcBorders>
+            <w:shd w:fill="F5F7FB" w:color="auto" w:val="clear"/>
+            <w:tcMar>
+              <w:top w:type="dxa" w:w="50"/>
+              <w:left w:type="dxa" w:w="90"/>
+              <w:bottom w:type="dxa" w:w="50"/>
+              <w:right w:type="dxa" w:w="90"/>
+            </w:tcMar>
+          </w:tcPr>
+          <w:p>
+            <w:pPr>
+              <w:jc w:val="left"/>
+            </w:pPr>
+            <w:r>
+              <w:rPr>
+                <w:sz w:val="19"/>
+                <w:szCs w:val="19"/>
+              </w:rPr>
+              <w:t xml:space="preserve">Phase Two added: drone sound library and training data, multimodal reference subtraction, drone voiceprint, 3D sound meter; report reorganized; Zenodo archive</w:t>
+            </w:r>
+          </w:p>
+        </w:tc>
+        <w:tc>
+          <w:tcPr>
+            <w:tcW w:type="dxa" w:w="2200"/>
+            <w:tcBorders>
+              <w:top w:val="single" w:color="A6A6A6" w:sz="4"/>
+              <w:left w:val="single" w:color="A6A6A6" w:sz="4"/>
+              <w:bottom w:val="single" w:color="A6A6A6" w:sz="4"/>
+              <w:right w:val="single" w:color="A6A6A6" w:sz="4"/>
+            </w:tcBorders>
+            <w:shd w:fill="F5F7FB" w:color="auto" w:val="clear"/>
+            <w:tcMar>
+              <w:top w:type="dxa" w:w="50"/>
+              <w:left w:type="dxa" w:w="90"/>
+              <w:bottom w:type="dxa" w:w="50"/>
+              <w:right w:type="dxa" w:w="90"/>
+            </w:tcMar>
+          </w:tcPr>
+          <w:p>
+            <w:pPr>
+              <w:jc w:val="left"/>
+            </w:pPr>
+            <w:r>
+              <w:rPr>
+                <w:sz w:val="19"/>
+                <w:szCs w:val="19"/>
+              </w:rPr>
+              <w:t xml:space="preserve">v2.0.0 (GitHub release, Zenodo DOI 10.5281/zenodo.23122229)</w:t>
+            </w:r>
+          </w:p>
+        </w:tc>
+      </w:tr>
+    </w:tbl>
     <w:p>
       <w:r>
         <w:br w:type="page"/>
@@ -1140,7 +1566,7 @@
                 <w:sz w:val="19"/>
                 <w:szCs w:val="19"/>
               </w:rPr>
-              <w:t xml:space="preserve">Zenodo archive with DOI linked to the GitHub repository; </w:t>
+              <w:t xml:space="preserve">GitHub release v2.0.0 archived on Zenodo (DOI 10.5281/zenodo.23122228); </w:t>
             </w:r>
             <w:r>
               <w:rPr>
@@ -17977,7 +18403,7 @@
       <w:r>
         <w:t xml:space="preserve">The source code, data download scripts, figures and this report are available in the GitHub repository </w:t>
       </w:r>
-      <w:hyperlink w:history="1" r:id="rIdczgj4zbkoyfvx2thb3ck6">
+      <w:hyperlink w:history="1" r:id="rIdj8kdangab8rf-pxkkzbaa">
         <w:r>
           <w:rPr>
             <w:rStyle w:val="Hyperlink"/>
@@ -17988,7 +18414,7 @@
       <w:r>
         <w:t xml:space="preserve"> [24] and are archived on Zenodo with the persistent identifier </w:t>
       </w:r>
-      <w:hyperlink w:history="1" r:id="rIduqmxxtkx6qlhhwruxxmuh">
+      <w:hyperlink w:history="1" r:id="rIdtdzip_wfazokeiir3srlo">
         <w:r>
           <w:rPr>
             <w:rStyle w:val="Hyperlink"/>
@@ -17999,7 +18425,7 @@
       <w:r>
         <w:t xml:space="preserve"> (concept DOI, all versions) [25]; the version described in this report (v2.0.0) is </w:t>
       </w:r>
-      <w:hyperlink w:history="1" r:id="rIdeuy499vt_gvvfny0j2-27">
+      <w:hyperlink w:history="1" r:id="rIdiymtnot1nysimws-vg_ng">
         <w:r>
           <w:rPr>
             <w:rStyle w:val="Hyperlink"/>
@@ -18008,7 +18434,18 @@
         </w:r>
       </w:hyperlink>
       <w:r>
-        <w:t xml:space="preserve">. Each GitHub release is archived automatically as a new Zenodo version under the same concept DOI. The public datasets used for training are available from their original sources [9], [17]–[20]; they are not redistributed with the code.</w:t>
+        <w:t xml:space="preserve">, published as GitHub release </w:t>
+      </w:r>
+      <w:hyperlink w:history="1" r:id="rIdofhwr3tm-l6ybdl_-bwnk">
+        <w:r>
+          <w:rPr>
+            <w:rStyle w:val="Hyperlink"/>
+          </w:rPr>
+          <w:t xml:space="preserve">v2.0.0</w:t>
+        </w:r>
+      </w:hyperlink>
+      <w:r>
+        <w:t xml:space="preserve"> on October 3, 2026. Each GitHub release is archived automatically as a new Zenodo version under the same concept DOI. The public datasets used for training are available from their original sources [9], [17]–[20]; they are not redistributed with the code.</w:t>
       </w:r>
     </w:p>
     <w:p>
@@ -18608,44 +19045,6 @@
       </w:pPr>
       <w:r>
         <w:t xml:space="preserve">A.1 Repository</w:t>
-      </w:r>
-    </w:p>
-    <w:p>
-      <w:pPr>
-        <w:spacing w:after="120"/>
-      </w:pPr>
-      <w:r>
-        <w:t xml:space="preserve">All Phase Two code, data download scripts, tests and figures are in the public repository </w:t>
-      </w:r>
-      <w:hyperlink w:history="1" r:id="rIdvbqydh3_jcyc275oluhhv">
-        <w:r>
-          <w:rPr>
-            <w:rStyle w:val="Hyperlink"/>
-          </w:rPr>
-          <w:t xml:space="preserve">https://github.com/husham-eng/Multimodal-Reference-Subtraction-Voiceprint-and-Three-Dimensional-Sound-Meter-for-Drone-Localization</w:t>
-        </w:r>
-      </w:hyperlink>
-      <w:r>
-        <w:t xml:space="preserve"> (branch main) [24], archived on Zenodo as </w:t>
-      </w:r>
-      <w:hyperlink w:history="1" r:id="rIdcyoafg398ob-keyqdehp5">
-        <w:r>
-          <w:rPr>
-            <w:rStyle w:val="Hyperlink"/>
-          </w:rPr>
-          <w:t xml:space="preserve">10.5281/zenodo.23122228</w:t>
-        </w:r>
-      </w:hyperlink>
-      <w:r>
-        <w:t xml:space="preserve"> [25]. The files CITATION.cff and .zenodo.json in the repository hold the citation and archive metadata.</w:t>
-      </w:r>
-    </w:p>
-    <w:p>
-      <w:pPr>
-        <w:pStyle w:val="Heading2"/>
-      </w:pPr>
-      <w:r>
-        <w:t xml:space="preserve">A.2 Phase Two Package droneloc (new)</w:t>
       </w:r>
     </w:p>
     <w:p>
@@ -18662,6 +19061,463 @@
           <w:szCs w:val="20"/>
         </w:rPr>
         <w:t xml:space="preserve">Table 17:</w:t>
+      </w:r>
+      <w:r>
+        <w:rPr>
+          <w:color w:val="595959"/>
+          <w:sz w:val="20"/>
+          <w:szCs w:val="20"/>
+        </w:rPr>
+        <w:t xml:space="preserve"> Project identifiers.</w:t>
+      </w:r>
+    </w:p>
+    <w:tbl>
+      <w:tblPr>
+        <w:tblW w:type="dxa" w:w="9070"/>
+        <w:tblBorders>
+          <w:top w:val="single" w:color="auto" w:sz="4"/>
+          <w:left w:val="single" w:color="auto" w:sz="4"/>
+          <w:bottom w:val="single" w:color="auto" w:sz="4"/>
+          <w:right w:val="single" w:color="auto" w:sz="4"/>
+          <w:insideH w:val="single" w:color="auto" w:sz="4"/>
+          <w:insideV w:val="single" w:color="auto" w:sz="4"/>
+        </w:tblBorders>
+      </w:tblPr>
+      <w:tblGrid>
+        <w:gridCol w:w="2600"/>
+        <w:gridCol w:w="6470"/>
+      </w:tblGrid>
+      <w:tr>
+        <w:trPr>
+          <w:tblHeader/>
+        </w:trPr>
+        <w:tc>
+          <w:tcPr>
+            <w:tcW w:type="dxa" w:w="2600"/>
+            <w:tcBorders>
+              <w:top w:val="single" w:color="A6A6A6" w:sz="4"/>
+              <w:left w:val="single" w:color="A6A6A6" w:sz="4"/>
+              <w:bottom w:val="single" w:color="A6A6A6" w:sz="4"/>
+              <w:right w:val="single" w:color="A6A6A6" w:sz="4"/>
+            </w:tcBorders>
+            <w:shd w:fill="DCE3F0" w:color="auto" w:val="clear"/>
+            <w:tcMar>
+              <w:top w:type="dxa" w:w="50"/>
+              <w:left w:type="dxa" w:w="90"/>
+              <w:bottom w:type="dxa" w:w="50"/>
+              <w:right w:type="dxa" w:w="90"/>
+            </w:tcMar>
+          </w:tcPr>
+          <w:p>
+            <w:pPr>
+              <w:jc w:val="left"/>
+            </w:pPr>
+            <w:r>
+              <w:rPr>
+                <w:b/>
+                <w:bCs/>
+                <w:sz w:val="19"/>
+                <w:szCs w:val="19"/>
+              </w:rPr>
+              <w:t xml:space="preserve">Item</w:t>
+            </w:r>
+          </w:p>
+        </w:tc>
+        <w:tc>
+          <w:tcPr>
+            <w:tcW w:type="dxa" w:w="6470"/>
+            <w:tcBorders>
+              <w:top w:val="single" w:color="A6A6A6" w:sz="4"/>
+              <w:left w:val="single" w:color="A6A6A6" w:sz="4"/>
+              <w:bottom w:val="single" w:color="A6A6A6" w:sz="4"/>
+              <w:right w:val="single" w:color="A6A6A6" w:sz="4"/>
+            </w:tcBorders>
+            <w:shd w:fill="DCE3F0" w:color="auto" w:val="clear"/>
+            <w:tcMar>
+              <w:top w:type="dxa" w:w="50"/>
+              <w:left w:type="dxa" w:w="90"/>
+              <w:bottom w:type="dxa" w:w="50"/>
+              <w:right w:type="dxa" w:w="90"/>
+            </w:tcMar>
+          </w:tcPr>
+          <w:p>
+            <w:pPr>
+              <w:jc w:val="left"/>
+            </w:pPr>
+            <w:r>
+              <w:rPr>
+                <w:b/>
+                <w:bCs/>
+                <w:sz w:val="19"/>
+                <w:szCs w:val="19"/>
+              </w:rPr>
+              <w:t xml:space="preserve">Identifier</w:t>
+            </w:r>
+          </w:p>
+        </w:tc>
+      </w:tr>
+      <w:tr>
+        <w:tc>
+          <w:tcPr>
+            <w:tcW w:type="dxa" w:w="2600"/>
+            <w:tcBorders>
+              <w:top w:val="single" w:color="A6A6A6" w:sz="4"/>
+              <w:left w:val="single" w:color="A6A6A6" w:sz="4"/>
+              <w:bottom w:val="single" w:color="A6A6A6" w:sz="4"/>
+              <w:right w:val="single" w:color="A6A6A6" w:sz="4"/>
+            </w:tcBorders>
+            <w:tcMar>
+              <w:top w:type="dxa" w:w="50"/>
+              <w:left w:type="dxa" w:w="90"/>
+              <w:bottom w:type="dxa" w:w="50"/>
+              <w:right w:type="dxa" w:w="90"/>
+            </w:tcMar>
+          </w:tcPr>
+          <w:p>
+            <w:pPr>
+              <w:jc w:val="left"/>
+            </w:pPr>
+            <w:r>
+              <w:rPr>
+                <w:sz w:val="19"/>
+                <w:szCs w:val="19"/>
+              </w:rPr>
+              <w:t xml:space="preserve">GitHub repository</w:t>
+            </w:r>
+          </w:p>
+        </w:tc>
+        <w:tc>
+          <w:tcPr>
+            <w:tcW w:type="dxa" w:w="6470"/>
+            <w:tcBorders>
+              <w:top w:val="single" w:color="A6A6A6" w:sz="4"/>
+              <w:left w:val="single" w:color="A6A6A6" w:sz="4"/>
+              <w:bottom w:val="single" w:color="A6A6A6" w:sz="4"/>
+              <w:right w:val="single" w:color="A6A6A6" w:sz="4"/>
+            </w:tcBorders>
+            <w:tcMar>
+              <w:top w:type="dxa" w:w="50"/>
+              <w:left w:type="dxa" w:w="90"/>
+              <w:bottom w:type="dxa" w:w="50"/>
+              <w:right w:type="dxa" w:w="90"/>
+            </w:tcMar>
+          </w:tcPr>
+          <w:p>
+            <w:pPr>
+              <w:jc w:val="left"/>
+            </w:pPr>
+            <w:r>
+              <w:rPr>
+                <w:sz w:val="19"/>
+                <w:szCs w:val="19"/>
+              </w:rPr>
+              <w:t xml:space="preserve">https://github.com/husham-eng/Multimodal-Reference-Subtraction-Voiceprint-and-Three-Dimensional-Sound-Meter-for-Drone-Localization</w:t>
+            </w:r>
+          </w:p>
+        </w:tc>
+      </w:tr>
+      <w:tr>
+        <w:tc>
+          <w:tcPr>
+            <w:tcW w:type="dxa" w:w="2600"/>
+            <w:tcBorders>
+              <w:top w:val="single" w:color="A6A6A6" w:sz="4"/>
+              <w:left w:val="single" w:color="A6A6A6" w:sz="4"/>
+              <w:bottom w:val="single" w:color="A6A6A6" w:sz="4"/>
+              <w:right w:val="single" w:color="A6A6A6" w:sz="4"/>
+            </w:tcBorders>
+            <w:shd w:fill="F5F7FB" w:color="auto" w:val="clear"/>
+            <w:tcMar>
+              <w:top w:type="dxa" w:w="50"/>
+              <w:left w:type="dxa" w:w="90"/>
+              <w:bottom w:type="dxa" w:w="50"/>
+              <w:right w:type="dxa" w:w="90"/>
+            </w:tcMar>
+          </w:tcPr>
+          <w:p>
+            <w:pPr>
+              <w:jc w:val="left"/>
+            </w:pPr>
+            <w:r>
+              <w:rPr>
+                <w:sz w:val="19"/>
+                <w:szCs w:val="19"/>
+              </w:rPr>
+              <w:t xml:space="preserve">Release described in this report</w:t>
+            </w:r>
+          </w:p>
+        </w:tc>
+        <w:tc>
+          <w:tcPr>
+            <w:tcW w:type="dxa" w:w="6470"/>
+            <w:tcBorders>
+              <w:top w:val="single" w:color="A6A6A6" w:sz="4"/>
+              <w:left w:val="single" w:color="A6A6A6" w:sz="4"/>
+              <w:bottom w:val="single" w:color="A6A6A6" w:sz="4"/>
+              <w:right w:val="single" w:color="A6A6A6" w:sz="4"/>
+            </w:tcBorders>
+            <w:shd w:fill="F5F7FB" w:color="auto" w:val="clear"/>
+            <w:tcMar>
+              <w:top w:type="dxa" w:w="50"/>
+              <w:left w:type="dxa" w:w="90"/>
+              <w:bottom w:type="dxa" w:w="50"/>
+              <w:right w:type="dxa" w:w="90"/>
+            </w:tcMar>
+          </w:tcPr>
+          <w:p>
+            <w:pPr>
+              <w:jc w:val="left"/>
+            </w:pPr>
+            <w:r>
+              <w:rPr>
+                <w:sz w:val="19"/>
+                <w:szCs w:val="19"/>
+              </w:rPr>
+              <w:t xml:space="preserve">v2.0.0 (October 3, 2026) — https://github.com/husham-eng/Multimodal-Reference-Subtraction-Voiceprint-and-Three-Dimensional-Sound-Meter-for-Drone-Localization/releases/tag/v2.0.0</w:t>
+            </w:r>
+          </w:p>
+        </w:tc>
+      </w:tr>
+      <w:tr>
+        <w:tc>
+          <w:tcPr>
+            <w:tcW w:type="dxa" w:w="2600"/>
+            <w:tcBorders>
+              <w:top w:val="single" w:color="A6A6A6" w:sz="4"/>
+              <w:left w:val="single" w:color="A6A6A6" w:sz="4"/>
+              <w:bottom w:val="single" w:color="A6A6A6" w:sz="4"/>
+              <w:right w:val="single" w:color="A6A6A6" w:sz="4"/>
+            </w:tcBorders>
+            <w:tcMar>
+              <w:top w:type="dxa" w:w="50"/>
+              <w:left w:type="dxa" w:w="90"/>
+              <w:bottom w:type="dxa" w:w="50"/>
+              <w:right w:type="dxa" w:w="90"/>
+            </w:tcMar>
+          </w:tcPr>
+          <w:p>
+            <w:pPr>
+              <w:jc w:val="left"/>
+            </w:pPr>
+            <w:r>
+              <w:rPr>
+                <w:sz w:val="19"/>
+                <w:szCs w:val="19"/>
+              </w:rPr>
+              <w:t xml:space="preserve">Zenodo DOI, all versions</w:t>
+            </w:r>
+          </w:p>
+        </w:tc>
+        <w:tc>
+          <w:tcPr>
+            <w:tcW w:type="dxa" w:w="6470"/>
+            <w:tcBorders>
+              <w:top w:val="single" w:color="A6A6A6" w:sz="4"/>
+              <w:left w:val="single" w:color="A6A6A6" w:sz="4"/>
+              <w:bottom w:val="single" w:color="A6A6A6" w:sz="4"/>
+              <w:right w:val="single" w:color="A6A6A6" w:sz="4"/>
+            </w:tcBorders>
+            <w:tcMar>
+              <w:top w:type="dxa" w:w="50"/>
+              <w:left w:type="dxa" w:w="90"/>
+              <w:bottom w:type="dxa" w:w="50"/>
+              <w:right w:type="dxa" w:w="90"/>
+            </w:tcMar>
+          </w:tcPr>
+          <w:p>
+            <w:pPr>
+              <w:jc w:val="left"/>
+            </w:pPr>
+            <w:r>
+              <w:rPr>
+                <w:sz w:val="19"/>
+                <w:szCs w:val="19"/>
+              </w:rPr>
+              <w:t xml:space="preserve">10.5281/zenodo.23122228 — https://doi.org/10.5281/zenodo.23122228</w:t>
+            </w:r>
+          </w:p>
+        </w:tc>
+      </w:tr>
+      <w:tr>
+        <w:tc>
+          <w:tcPr>
+            <w:tcW w:type="dxa" w:w="2600"/>
+            <w:tcBorders>
+              <w:top w:val="single" w:color="A6A6A6" w:sz="4"/>
+              <w:left w:val="single" w:color="A6A6A6" w:sz="4"/>
+              <w:bottom w:val="single" w:color="A6A6A6" w:sz="4"/>
+              <w:right w:val="single" w:color="A6A6A6" w:sz="4"/>
+            </w:tcBorders>
+            <w:shd w:fill="F5F7FB" w:color="auto" w:val="clear"/>
+            <w:tcMar>
+              <w:top w:type="dxa" w:w="50"/>
+              <w:left w:type="dxa" w:w="90"/>
+              <w:bottom w:type="dxa" w:w="50"/>
+              <w:right w:type="dxa" w:w="90"/>
+            </w:tcMar>
+          </w:tcPr>
+          <w:p>
+            <w:pPr>
+              <w:jc w:val="left"/>
+            </w:pPr>
+            <w:r>
+              <w:rPr>
+                <w:sz w:val="19"/>
+                <w:szCs w:val="19"/>
+              </w:rPr>
+              <w:t xml:space="preserve">Zenodo DOI, version 2.0.0</w:t>
+            </w:r>
+          </w:p>
+        </w:tc>
+        <w:tc>
+          <w:tcPr>
+            <w:tcW w:type="dxa" w:w="6470"/>
+            <w:tcBorders>
+              <w:top w:val="single" w:color="A6A6A6" w:sz="4"/>
+              <w:left w:val="single" w:color="A6A6A6" w:sz="4"/>
+              <w:bottom w:val="single" w:color="A6A6A6" w:sz="4"/>
+              <w:right w:val="single" w:color="A6A6A6" w:sz="4"/>
+            </w:tcBorders>
+            <w:shd w:fill="F5F7FB" w:color="auto" w:val="clear"/>
+            <w:tcMar>
+              <w:top w:type="dxa" w:w="50"/>
+              <w:left w:type="dxa" w:w="90"/>
+              <w:bottom w:type="dxa" w:w="50"/>
+              <w:right w:type="dxa" w:w="90"/>
+            </w:tcMar>
+          </w:tcPr>
+          <w:p>
+            <w:pPr>
+              <w:jc w:val="left"/>
+            </w:pPr>
+            <w:r>
+              <w:rPr>
+                <w:sz w:val="19"/>
+                <w:szCs w:val="19"/>
+              </w:rPr>
+              <w:t xml:space="preserve">10.5281/zenodo.23122229 — https://doi.org/10.5281/zenodo.23122229</w:t>
+            </w:r>
+          </w:p>
+        </w:tc>
+      </w:tr>
+      <w:tr>
+        <w:tc>
+          <w:tcPr>
+            <w:tcW w:type="dxa" w:w="2600"/>
+            <w:tcBorders>
+              <w:top w:val="single" w:color="A6A6A6" w:sz="4"/>
+              <w:left w:val="single" w:color="A6A6A6" w:sz="4"/>
+              <w:bottom w:val="single" w:color="A6A6A6" w:sz="4"/>
+              <w:right w:val="single" w:color="A6A6A6" w:sz="4"/>
+            </w:tcBorders>
+            <w:tcMar>
+              <w:top w:type="dxa" w:w="50"/>
+              <w:left w:type="dxa" w:w="90"/>
+              <w:bottom w:type="dxa" w:w="50"/>
+              <w:right w:type="dxa" w:w="90"/>
+            </w:tcMar>
+          </w:tcPr>
+          <w:p>
+            <w:pPr>
+              <w:jc w:val="left"/>
+            </w:pPr>
+            <w:r>
+              <w:rPr>
+                <w:sz w:val="19"/>
+                <w:szCs w:val="19"/>
+              </w:rPr>
+              <w:t xml:space="preserve">License</w:t>
+            </w:r>
+          </w:p>
+        </w:tc>
+        <w:tc>
+          <w:tcPr>
+            <w:tcW w:type="dxa" w:w="6470"/>
+            <w:tcBorders>
+              <w:top w:val="single" w:color="A6A6A6" w:sz="4"/>
+              <w:left w:val="single" w:color="A6A6A6" w:sz="4"/>
+              <w:bottom w:val="single" w:color="A6A6A6" w:sz="4"/>
+              <w:right w:val="single" w:color="A6A6A6" w:sz="4"/>
+            </w:tcBorders>
+            <w:tcMar>
+              <w:top w:type="dxa" w:w="50"/>
+              <w:left w:type="dxa" w:w="90"/>
+              <w:bottom w:type="dxa" w:w="50"/>
+              <w:right w:type="dxa" w:w="90"/>
+            </w:tcMar>
+          </w:tcPr>
+          <w:p>
+            <w:pPr>
+              <w:jc w:val="left"/>
+            </w:pPr>
+            <w:r>
+              <w:rPr>
+                <w:sz w:val="19"/>
+                <w:szCs w:val="19"/>
+              </w:rPr>
+              <w:t xml:space="preserve">To be added in the next release</w:t>
+            </w:r>
+          </w:p>
+        </w:tc>
+      </w:tr>
+    </w:tbl>
+    <w:p>
+      <w:pPr>
+        <w:spacing w:after="120"/>
+      </w:pPr>
+    </w:p>
+    <w:p>
+      <w:pPr>
+        <w:spacing w:after="120"/>
+      </w:pPr>
+      <w:r>
+        <w:t xml:space="preserve">All Phase Two code, data download scripts, tests and figures are in the public repository </w:t>
+      </w:r>
+      <w:hyperlink w:history="1" r:id="rIdnmsgk6mmxgdqt8x-re3g6">
+        <w:r>
+          <w:rPr>
+            <w:rStyle w:val="Hyperlink"/>
+          </w:rPr>
+          <w:t xml:space="preserve">https://github.com/husham-eng/Multimodal-Reference-Subtraction-Voiceprint-and-Three-Dimensional-Sound-Meter-for-Drone-Localization</w:t>
+        </w:r>
+      </w:hyperlink>
+      <w:r>
+        <w:t xml:space="preserve"> (branch main) [24], archived on Zenodo as </w:t>
+      </w:r>
+      <w:hyperlink w:history="1" r:id="rIdzjnyeq_tlut4bp1fhwxeo">
+        <w:r>
+          <w:rPr>
+            <w:rStyle w:val="Hyperlink"/>
+          </w:rPr>
+          <w:t xml:space="preserve">10.5281/zenodo.23122228</w:t>
+        </w:r>
+      </w:hyperlink>
+      <w:r>
+        <w:t xml:space="preserve"> [25]. The files CITATION.cff and .zenodo.json in the repository hold the citation and archive metadata.</w:t>
+      </w:r>
+    </w:p>
+    <w:p>
+      <w:pPr>
+        <w:pStyle w:val="Heading2"/>
+      </w:pPr>
+      <w:r>
+        <w:t xml:space="preserve">A.2 Phase Two Package droneloc (new)</w:t>
+      </w:r>
+    </w:p>
+    <w:p>
+      <w:pPr>
+        <w:keepNext/>
+        <w:spacing w:after="80" w:before="160"/>
+      </w:pPr>
+      <w:r>
+        <w:rPr>
+          <w:b/>
+          <w:bCs/>
+          <w:color w:val="595959"/>
+          <w:sz w:val="20"/>
+          <w:szCs w:val="20"/>
+        </w:rPr>
+        <w:t xml:space="preserve">Table 18:</w:t>
       </w:r>
       <w:r>
         <w:rPr>
@@ -19616,7 +20472,7 @@
           <w:sz w:val="20"/>
           <w:szCs w:val="20"/>
         </w:rPr>
-        <w:t xml:space="preserve">Table 18:</w:t>
+        <w:t xml:space="preserve">Table 19:</w:t>
       </w:r>
       <w:r>
         <w:rPr>

</xml_diff>

<commit_message>
Add MIT license and prepare release 2.0.1
- LICENSE (MIT), license in .zenodo.json and CITATION.cff
- version 2.0.1 metadata; report lists license, release and history

Co-Authored-By: Claude Opus 5.5 <noreply@anthropic.com>
Claude-Session: https://claude.ai/code/session_01Tjp7tKuW9QND1aAEqAWhGA
</commit_message>
<xml_diff>
--- a/docs/Drone_Acoustic_Guidance_Report_EN_v2.docx
+++ b/docs/Drone_Acoustic_Guidance_Report_EN_v2.docx
@@ -120,7 +120,7 @@
         <w:spacing w:after="60"/>
         <w:jc w:val="center"/>
       </w:pPr>
-      <w:hyperlink w:history="1" r:id="rIdayq4tao9oi0cpptmb3shb">
+      <w:hyperlink w:history="1" r:id="rIdmplulthluixxfuz_k83p6">
         <w:r>
           <w:rPr>
             <w:rStyle w:val="Hyperlink"/>
@@ -162,7 +162,7 @@
         <w:spacing w:after="40"/>
         <w:jc w:val="center"/>
       </w:pPr>
-      <w:hyperlink w:history="1" r:id="rIdzicvfh-fxakabx3umvbn7">
+      <w:hyperlink w:history="1" r:id="rIdytnmy1dpgo4syzuwiq3gr">
         <w:r>
           <w:rPr>
             <w:rStyle w:val="Hyperlink"/>
@@ -183,7 +183,7 @@
         </w:rPr>
         <w:t xml:space="preserve">Version 2.0.0: </w:t>
       </w:r>
-      <w:hyperlink w:history="1" r:id="rIdd1sc2a0mxsg2qep29yfa4">
+      <w:hyperlink w:history="1" r:id="rIdyoizbnfyrrfazcfh04wen">
         <w:r>
           <w:rPr>
             <w:rStyle w:val="Hyperlink"/>
@@ -650,6 +650,124 @@
                 <w:szCs w:val="19"/>
               </w:rPr>
               <w:t xml:space="preserve">v2.0.0 (GitHub release, Zenodo DOI 10.5281/zenodo.23122229)</w:t>
+            </w:r>
+          </w:p>
+        </w:tc>
+      </w:tr>
+      <w:tr>
+        <w:tc>
+          <w:tcPr>
+            <w:tcW w:type="dxa" w:w="1100"/>
+            <w:tcBorders>
+              <w:top w:val="single" w:color="A6A6A6" w:sz="4"/>
+              <w:left w:val="single" w:color="A6A6A6" w:sz="4"/>
+              <w:bottom w:val="single" w:color="A6A6A6" w:sz="4"/>
+              <w:right w:val="single" w:color="A6A6A6" w:sz="4"/>
+            </w:tcBorders>
+            <w:tcMar>
+              <w:top w:type="dxa" w:w="50"/>
+              <w:left w:type="dxa" w:w="90"/>
+              <w:bottom w:type="dxa" w:w="50"/>
+              <w:right w:type="dxa" w:w="90"/>
+            </w:tcMar>
+          </w:tcPr>
+          <w:p>
+            <w:pPr>
+              <w:jc w:val="left"/>
+            </w:pPr>
+            <w:r>
+              <w:rPr>
+                <w:sz w:val="19"/>
+                <w:szCs w:val="19"/>
+              </w:rPr>
+              <w:t xml:space="preserve">2.1</w:t>
+            </w:r>
+          </w:p>
+        </w:tc>
+        <w:tc>
+          <w:tcPr>
+            <w:tcW w:type="dxa" w:w="1600"/>
+            <w:tcBorders>
+              <w:top w:val="single" w:color="A6A6A6" w:sz="4"/>
+              <w:left w:val="single" w:color="A6A6A6" w:sz="4"/>
+              <w:bottom w:val="single" w:color="A6A6A6" w:sz="4"/>
+              <w:right w:val="single" w:color="A6A6A6" w:sz="4"/>
+            </w:tcBorders>
+            <w:tcMar>
+              <w:top w:type="dxa" w:w="50"/>
+              <w:left w:type="dxa" w:w="90"/>
+              <w:bottom w:type="dxa" w:w="50"/>
+              <w:right w:type="dxa" w:w="90"/>
+            </w:tcMar>
+          </w:tcPr>
+          <w:p>
+            <w:pPr>
+              <w:jc w:val="left"/>
+            </w:pPr>
+            <w:r>
+              <w:rPr>
+                <w:sz w:val="19"/>
+                <w:szCs w:val="19"/>
+              </w:rPr>
+              <w:t xml:space="preserve">October 2026</w:t>
+            </w:r>
+          </w:p>
+        </w:tc>
+        <w:tc>
+          <w:tcPr>
+            <w:tcW w:type="dxa" w:w="4170"/>
+            <w:tcBorders>
+              <w:top w:val="single" w:color="A6A6A6" w:sz="4"/>
+              <w:left w:val="single" w:color="A6A6A6" w:sz="4"/>
+              <w:bottom w:val="single" w:color="A6A6A6" w:sz="4"/>
+              <w:right w:val="single" w:color="A6A6A6" w:sz="4"/>
+            </w:tcBorders>
+            <w:tcMar>
+              <w:top w:type="dxa" w:w="50"/>
+              <w:left w:type="dxa" w:w="90"/>
+              <w:bottom w:type="dxa" w:w="50"/>
+              <w:right w:type="dxa" w:w="90"/>
+            </w:tcMar>
+          </w:tcPr>
+          <w:p>
+            <w:pPr>
+              <w:jc w:val="left"/>
+            </w:pPr>
+            <w:r>
+              <w:rPr>
+                <w:sz w:val="19"/>
+                <w:szCs w:val="19"/>
+              </w:rPr>
+              <w:t xml:space="preserve">Final report: affiliation, document history, project identifiers, MIT license</w:t>
+            </w:r>
+          </w:p>
+        </w:tc>
+        <w:tc>
+          <w:tcPr>
+            <w:tcW w:type="dxa" w:w="2200"/>
+            <w:tcBorders>
+              <w:top w:val="single" w:color="A6A6A6" w:sz="4"/>
+              <w:left w:val="single" w:color="A6A6A6" w:sz="4"/>
+              <w:bottom w:val="single" w:color="A6A6A6" w:sz="4"/>
+              <w:right w:val="single" w:color="A6A6A6" w:sz="4"/>
+            </w:tcBorders>
+            <w:tcMar>
+              <w:top w:type="dxa" w:w="50"/>
+              <w:left w:type="dxa" w:w="90"/>
+              <w:bottom w:type="dxa" w:w="50"/>
+              <w:right w:type="dxa" w:w="90"/>
+            </w:tcMar>
+          </w:tcPr>
+          <w:p>
+            <w:pPr>
+              <w:jc w:val="left"/>
+            </w:pPr>
+            <w:r>
+              <w:rPr>
+                <w:sz w:val="19"/>
+                <w:szCs w:val="19"/>
+              </w:rPr>
+              <w:t xml:space="preserve">v2.0.1 (GitHub release, Zenodo; same all-versions DOI)</w:t>
             </w:r>
           </w:p>
         </w:tc>
@@ -18403,7 +18521,7 @@
       <w:r>
         <w:t xml:space="preserve">The source code, data download scripts, figures and this report are available in the GitHub repository </w:t>
       </w:r>
-      <w:hyperlink w:history="1" r:id="rIdj8kdangab8rf-pxkkzbaa">
+      <w:hyperlink w:history="1" r:id="rIdvg4bmozdddsugy4wenrik">
         <w:r>
           <w:rPr>
             <w:rStyle w:val="Hyperlink"/>
@@ -18414,7 +18532,7 @@
       <w:r>
         <w:t xml:space="preserve"> [24] and are archived on Zenodo with the persistent identifier </w:t>
       </w:r>
-      <w:hyperlink w:history="1" r:id="rIdtdzip_wfazokeiir3srlo">
+      <w:hyperlink w:history="1" r:id="rIdzc2_4tl_dppph182z1hyl">
         <w:r>
           <w:rPr>
             <w:rStyle w:val="Hyperlink"/>
@@ -18425,7 +18543,7 @@
       <w:r>
         <w:t xml:space="preserve"> (concept DOI, all versions) [25]; the version described in this report (v2.0.0) is </w:t>
       </w:r>
-      <w:hyperlink w:history="1" r:id="rIdiymtnot1nysimws-vg_ng">
+      <w:hyperlink w:history="1" r:id="rIdvsuarmnyamedbxl_skqox">
         <w:r>
           <w:rPr>
             <w:rStyle w:val="Hyperlink"/>
@@ -18436,7 +18554,7 @@
       <w:r>
         <w:t xml:space="preserve">, published as GitHub release </w:t>
       </w:r>
-      <w:hyperlink w:history="1" r:id="rIdofhwr3tm-l6ybdl_-bwnk">
+      <w:hyperlink w:history="1" r:id="rId0olat0-gsltssnfmasikq">
         <w:r>
           <w:rPr>
             <w:rStyle w:val="Hyperlink"/>
@@ -19028,7 +19146,7 @@
           <w:sz w:val="20"/>
           <w:szCs w:val="20"/>
         </w:rPr>
-        <w:t xml:space="preserve">H. Saied, "Multimodal Reference Subtraction, Drone Voiceprint and Three-Dimensional Sound Meter for Drone Localization" (software and report, version 2.0.0), Zenodo, 2026. doi: 10.5281/zenodo.23122228 (all versions); version 2.0.0: doi: 10.5281/zenodo.23122229. https://doi.org/10.5281/zenodo.23122228</w:t>
+        <w:t xml:space="preserve">H. Saied, "Multimodal Reference Subtraction, Drone Voiceprint and Three-Dimensional Sound Meter for Drone Localization" (software and report, versions 2.0.0–2.0.1, MIT license), Zenodo, 2026. doi: 10.5281/zenodo.23122228 (all versions); version 2.0.0: doi: 10.5281/zenodo.23122229. https://doi.org/10.5281/zenodo.23122228</w:t>
       </w:r>
     </w:p>
     <w:p>
@@ -19455,7 +19573,69 @@
                 <w:sz w:val="19"/>
                 <w:szCs w:val="19"/>
               </w:rPr>
-              <w:t xml:space="preserve">To be added in the next release</w:t>
+              <w:t xml:space="preserve">MIT (code); see the LICENSE file in the repository</w:t>
+            </w:r>
+          </w:p>
+        </w:tc>
+      </w:tr>
+      <w:tr>
+        <w:tc>
+          <w:tcPr>
+            <w:tcW w:type="dxa" w:w="2600"/>
+            <w:tcBorders>
+              <w:top w:val="single" w:color="A6A6A6" w:sz="4"/>
+              <w:left w:val="single" w:color="A6A6A6" w:sz="4"/>
+              <w:bottom w:val="single" w:color="A6A6A6" w:sz="4"/>
+              <w:right w:val="single" w:color="A6A6A6" w:sz="4"/>
+            </w:tcBorders>
+            <w:shd w:fill="F5F7FB" w:color="auto" w:val="clear"/>
+            <w:tcMar>
+              <w:top w:type="dxa" w:w="50"/>
+              <w:left w:type="dxa" w:w="90"/>
+              <w:bottom w:type="dxa" w:w="50"/>
+              <w:right w:type="dxa" w:w="90"/>
+            </w:tcMar>
+          </w:tcPr>
+          <w:p>
+            <w:pPr>
+              <w:jc w:val="left"/>
+            </w:pPr>
+            <w:r>
+              <w:rPr>
+                <w:sz w:val="19"/>
+                <w:szCs w:val="19"/>
+              </w:rPr>
+              <w:t xml:space="preserve">Latest release</w:t>
+            </w:r>
+          </w:p>
+        </w:tc>
+        <w:tc>
+          <w:tcPr>
+            <w:tcW w:type="dxa" w:w="6470"/>
+            <w:tcBorders>
+              <w:top w:val="single" w:color="A6A6A6" w:sz="4"/>
+              <w:left w:val="single" w:color="A6A6A6" w:sz="4"/>
+              <w:bottom w:val="single" w:color="A6A6A6" w:sz="4"/>
+              <w:right w:val="single" w:color="A6A6A6" w:sz="4"/>
+            </w:tcBorders>
+            <w:shd w:fill="F5F7FB" w:color="auto" w:val="clear"/>
+            <w:tcMar>
+              <w:top w:type="dxa" w:w="50"/>
+              <w:left w:type="dxa" w:w="90"/>
+              <w:bottom w:type="dxa" w:w="50"/>
+              <w:right w:type="dxa" w:w="90"/>
+            </w:tcMar>
+          </w:tcPr>
+          <w:p>
+            <w:pPr>
+              <w:jc w:val="left"/>
+            </w:pPr>
+            <w:r>
+              <w:rPr>
+                <w:sz w:val="19"/>
+                <w:szCs w:val="19"/>
+              </w:rPr>
+              <w:t xml:space="preserve">v2.0.1 — adds the MIT license and this final report; always reachable through the all-versions DOI</w:t>
             </w:r>
           </w:p>
         </w:tc>
@@ -19473,7 +19653,7 @@
       <w:r>
         <w:t xml:space="preserve">All Phase Two code, data download scripts, tests and figures are in the public repository </w:t>
       </w:r>
-      <w:hyperlink w:history="1" r:id="rIdnmsgk6mmxgdqt8x-re3g6">
+      <w:hyperlink w:history="1" r:id="rIdhyin99qvwbp0mnwaq6bxf">
         <w:r>
           <w:rPr>
             <w:rStyle w:val="Hyperlink"/>
@@ -19484,7 +19664,7 @@
       <w:r>
         <w:t xml:space="preserve"> (branch main) [24], archived on Zenodo as </w:t>
       </w:r>
-      <w:hyperlink w:history="1" r:id="rIdzjnyeq_tlut4bp1fhwxeo">
+      <w:hyperlink w:history="1" r:id="rIdj_xr9rzszdbx8fweokd40">
         <w:r>
           <w:rPr>
             <w:rStyle w:val="Hyperlink"/>

</xml_diff>

<commit_message>
Revision tools: MAP signature decision, sensor augmentation, figures, docs
- drone-type signature: MAP decision, +-30% RPM training, sphere colouring augmentation
- realistic sensor model in the demo pipeline, 300 dpi plots
- revision runner, summary and 600 dpi figure scripts
- hardware build and test guide (Arabic), README section, affiliation corrected

Co-Authored-By: Claude Opus 5.5 <noreply@anthropic.com>
Claude-Session: https://claude.ai/code/session_01Tjp7tKuW9QND1aAEqAWhGA
</commit_message>
<xml_diff>
--- a/docs/Drone_Acoustic_Guidance_Report_EN_v2.docx
+++ b/docs/Drone_Acoustic_Guidance_Report_EN_v2.docx
@@ -85,7 +85,7 @@
           <w:sz w:val="22"/>
           <w:szCs w:val="22"/>
         </w:rPr>
-        <w:t xml:space="preserve">Prince Sultan Military College of Health</w:t>
+        <w:t xml:space="preserve">Prince Sultan Military College of Health Sciences, Dhahran, Saudi Arabia</w:t>
       </w:r>
     </w:p>
     <w:p>
@@ -120,7 +120,7 @@
         <w:spacing w:after="60"/>
         <w:jc w:val="center"/>
       </w:pPr>
-      <w:hyperlink w:history="1" r:id="rIdmplulthluixxfuz_k83p6">
+      <w:hyperlink w:history="1" r:id="rIdmlg56hlenunyfj0rnjqvm">
         <w:r>
           <w:rPr>
             <w:rStyle w:val="Hyperlink"/>
@@ -162,7 +162,7 @@
         <w:spacing w:after="40"/>
         <w:jc w:val="center"/>
       </w:pPr>
-      <w:hyperlink w:history="1" r:id="rIdytnmy1dpgo4syzuwiq3gr">
+      <w:hyperlink w:history="1" r:id="rIdoiuysq1jnr4agebhazbzj">
         <w:r>
           <w:rPr>
             <w:rStyle w:val="Hyperlink"/>
@@ -183,7 +183,7 @@
         </w:rPr>
         <w:t xml:space="preserve">Version 2.0.0: </w:t>
       </w:r>
-      <w:hyperlink w:history="1" r:id="rIdyoizbnfyrrfazcfh04wen">
+      <w:hyperlink w:history="1" r:id="rIdog7se-5ubxbm27yt6b-jv">
         <w:r>
           <w:rPr>
             <w:rStyle w:val="Hyperlink"/>
@@ -18521,7 +18521,7 @@
       <w:r>
         <w:t xml:space="preserve">The source code, data download scripts, figures and this report are available in the GitHub repository </w:t>
       </w:r>
-      <w:hyperlink w:history="1" r:id="rIdvg4bmozdddsugy4wenrik">
+      <w:hyperlink w:history="1" r:id="rIdzw3rrjwuzsote2chcpcv7">
         <w:r>
           <w:rPr>
             <w:rStyle w:val="Hyperlink"/>
@@ -18532,7 +18532,7 @@
       <w:r>
         <w:t xml:space="preserve"> [24] and are archived on Zenodo with the persistent identifier </w:t>
       </w:r>
-      <w:hyperlink w:history="1" r:id="rIdzc2_4tl_dppph182z1hyl">
+      <w:hyperlink w:history="1" r:id="rIdm05dxobfvvcn0vryedeoc">
         <w:r>
           <w:rPr>
             <w:rStyle w:val="Hyperlink"/>
@@ -18543,7 +18543,7 @@
       <w:r>
         <w:t xml:space="preserve"> (concept DOI, all versions) [25]; the version described in this report (v2.0.0) is </w:t>
       </w:r>
-      <w:hyperlink w:history="1" r:id="rIdvsuarmnyamedbxl_skqox">
+      <w:hyperlink w:history="1" r:id="rIdcxybxk7jm969m8pqddap1">
         <w:r>
           <w:rPr>
             <w:rStyle w:val="Hyperlink"/>
@@ -18554,7 +18554,7 @@
       <w:r>
         <w:t xml:space="preserve">, published as GitHub release </w:t>
       </w:r>
-      <w:hyperlink w:history="1" r:id="rId0olat0-gsltssnfmasikq">
+      <w:hyperlink w:history="1" r:id="rIdkpy1edidzcjybhyxkg82m">
         <w:r>
           <w:rPr>
             <w:rStyle w:val="Hyperlink"/>
@@ -19653,7 +19653,7 @@
       <w:r>
         <w:t xml:space="preserve">All Phase Two code, data download scripts, tests and figures are in the public repository </w:t>
       </w:r>
-      <w:hyperlink w:history="1" r:id="rIdhyin99qvwbp0mnwaq6bxf">
+      <w:hyperlink w:history="1" r:id="rIdgslzd0lgdz-zhivam59qb">
         <w:r>
           <w:rPr>
             <w:rStyle w:val="Hyperlink"/>
@@ -19664,7 +19664,7 @@
       <w:r>
         <w:t xml:space="preserve"> (branch main) [24], archived on Zenodo as </w:t>
       </w:r>
-      <w:hyperlink w:history="1" r:id="rIdj_xr9rzszdbx8fweokd40">
+      <w:hyperlink w:history="1" r:id="rIdxugpz39e-i_twp9pgjcfy">
         <w:r>
           <w:rPr>
             <w:rStyle w:val="Hyperlink"/>

</xml_diff>

<commit_message>
Remove remaining review wording from code, results and the project report
- policy labels: (original) -> (baseline), (revised) -> (proposed); the
  M1 'original' label -> 'fixed grid'; result JSON keys and figures
  regenerated accordingly (numbers unchanged)
- project report: 'Revision' -> 'Version' throughout
- docstrings no longer refer to an earlier manuscript

Co-Authored-By: Claude Opus 5.5 <noreply@anthropic.com>
Claude-Session: https://claude.ai/code/session_01Tjp7tKuW9QND1aAEqAWhGA
</commit_message>
<xml_diff>
--- a/docs/Drone_Acoustic_Guidance_Report_EN_v2.docx
+++ b/docs/Drone_Acoustic_Guidance_Report_EN_v2.docx
@@ -58,7 +58,7 @@
           <w:sz w:val="22"/>
           <w:szCs w:val="22"/>
         </w:rPr>
-        <w:t xml:space="preserve">Revision 2 — updated with training data, new results and the public code repository</w:t>
+        <w:t xml:space="preserve">Version 2 — Phase Two with training data, results and the public code repository</w:t>
       </w:r>
     </w:p>
     <w:p>
@@ -120,7 +120,7 @@
         <w:spacing w:after="60"/>
         <w:jc w:val="center"/>
       </w:pPr>
-      <w:hyperlink w:history="1" r:id="rIdmlg56hlenunyfj0rnjqvm">
+      <w:hyperlink w:history="1" r:id="rIdqhwqhwaubte7jfv8dl2zc">
         <w:r>
           <w:rPr>
             <w:rStyle w:val="Hyperlink"/>
@@ -162,7 +162,7 @@
         <w:spacing w:after="40"/>
         <w:jc w:val="center"/>
       </w:pPr>
-      <w:hyperlink w:history="1" r:id="rIdoiuysq1jnr4agebhazbzj">
+      <w:hyperlink w:history="1" r:id="rId2yhrtdi8ai6zomot2ifv9">
         <w:r>
           <w:rPr>
             <w:rStyle w:val="Hyperlink"/>
@@ -183,7 +183,7 @@
         </w:rPr>
         <w:t xml:space="preserve">Version 2.0.0: </w:t>
       </w:r>
-      <w:hyperlink w:history="1" r:id="rIdog7se-5ubxbm27yt6b-jv">
+      <w:hyperlink w:history="1" r:id="rIdr7efcasnijh_y7nnae4mn">
         <w:r>
           <w:rPr>
             <w:rStyle w:val="Hyperlink"/>
@@ -313,7 +313,7 @@
                 <w:sz w:val="19"/>
                 <w:szCs w:val="19"/>
               </w:rPr>
-              <w:t xml:space="preserve">Revision</w:t>
+              <w:t xml:space="preserve">Version</w:t>
             </w:r>
           </w:p>
         </w:tc>
@@ -831,7 +831,7 @@
           <w:b/>
           <w:bCs/>
         </w:rPr>
-        <w:t xml:space="preserve">Phase Two (passive voiceprint localization, new in this revision).</w:t>
+        <w:t xml:space="preserve">Phase Two (passive voiceprint localization, new in this version).</w:t>
       </w:r>
       <w:r>
         <w:t xml:space="preserve"> No beacon is required: the array listens to the drone's own rotor sound. Interference from equipment near the array is removed by a trained </w:t>
@@ -888,7 +888,7 @@
         <w:pStyle w:val="Heading1"/>
       </w:pPr>
       <w:r>
-        <w:t xml:space="preserve">What Is New in This Revision</w:t>
+        <w:t xml:space="preserve">What Is New in Version 2</w:t>
       </w:r>
     </w:p>
     <w:p>
@@ -897,7 +897,7 @@
         <w:jc w:val="both"/>
       </w:pPr>
       <w:r>
-        <w:t xml:space="preserve">The first version of this report covered Phase One only, used synthetic signals exclusively and listed the reference-subtraction classifier as future work. This revision implements that classifier and extends the system to passive localization. Table 1 summarizes every change; the new material is in Sections 3.2–3.3, 5, 6, 7.2, 8.7–8.10 and Appendix A.2–A.3.</w:t>
+        <w:t xml:space="preserve">The first version of this report covered Phase One only, used synthetic signals exclusively and listed the reference-subtraction classifier as future work. This version implements that classifier and extends the system to passive localization. Table 1 summarizes every change; the new material is in Sections 3.2–3.3, 5, 6, 7.2, 8.7–8.10 and Appendix A.2–A.3.</w:t>
       </w:r>
     </w:p>
     <w:p>
@@ -1005,7 +1005,7 @@
                 <w:sz w:val="19"/>
                 <w:szCs w:val="19"/>
               </w:rPr>
-              <w:t xml:space="preserve">Previous version</w:t>
+              <w:t xml:space="preserve">Version 1</w:t>
             </w:r>
           </w:p>
         </w:tc>
@@ -1037,7 +1037,7 @@
                 <w:sz w:val="19"/>
                 <w:szCs w:val="19"/>
               </w:rPr>
-              <w:t xml:space="preserve">This revision</w:t>
+              <w:t xml:space="preserve">Version 2</w:t>
             </w:r>
           </w:p>
         </w:tc>
@@ -3130,7 +3130,7 @@
         <w:jc w:val="both"/>
       </w:pPr>
       <w:r>
-        <w:t xml:space="preserve">Noise subtraction goes back to spectral subtraction by Boll [10] and to adaptive noise cancellation with a noise reference by Widrow et al. [11]. The subtractive-reference technique of the researcher's previous work builds on this idea; in this revision it is generalized to several reference sensors of different modalities (acoustic and vibration).</w:t>
+        <w:t xml:space="preserve">Noise subtraction goes back to spectral subtraction by Boll [10] and to adaptive noise cancellation with a noise reference by Widrow et al. [11]. The subtractive-reference technique of the researcher's previous work builds on this idea; here it is generalized to several reference sensors of different modalities (acoustic and vibration).</w:t>
       </w:r>
     </w:p>
     <w:p>
@@ -18187,7 +18187,7 @@
         <w:pStyle w:val="Heading2"/>
       </w:pPr>
       <w:r>
-        <w:t xml:space="preserve">8.2 Fusion Weights Need Revision</w:t>
+        <w:t xml:space="preserve">8.2 Fusion Weights Need Adjustment</w:t>
       </w:r>
     </w:p>
     <w:p>
@@ -18392,7 +18392,7 @@
         <w:jc w:val="both"/>
       </w:pPr>
       <w:r>
-        <w:t xml:space="preserve">This report presented an acoustic guidance and localization system built on a 160 mm six-microphone sphere. Phase One showed in closed-loop simulation that short rotor silence windows are essential for beacon homing and that the six-pair method outperforms the top-three-microphones method. Phase Two, new in this revision, implemented the planned reference-subtraction classifier as a multimodal canceller and a drone voiceprint, assembled a drone sound library from synthetic models and public datasets, and showed that a voiceprint-guided 3D sound meter locates an approaching drone with a median direction error of about 1° where the unprocessed array fails completely. The code, data scripts and figures are public in the project repository.</w:t>
+        <w:t xml:space="preserve">This report presented an acoustic guidance and localization system built on a 160 mm six-microphone sphere. Phase One showed in closed-loop simulation that short rotor silence windows are essential for beacon homing and that the six-pair method outperforms the top-three-microphones method. Phase Two, new in this version, implemented the planned reference-subtraction classifier as a multimodal canceller and a drone voiceprint, assembled a drone sound library from synthetic models and public datasets, and showed that a voiceprint-guided 3D sound meter locates an approaching drone with a median direction error of about 1° where the unprocessed array fails completely. The code, data scripts and figures are public in the project repository.</w:t>
       </w:r>
     </w:p>
     <w:p>
@@ -18421,10 +18421,10 @@
           <w:b/>
           <w:bCs/>
         </w:rPr>
-        <w:t xml:space="preserve">completed in this revision</w:t>
-      </w:r>
-      <w:r>
-        <w:t xml:space="preserve"> (Phase Two).</w:t>
+        <w:t xml:space="preserve">completed in Phase Two</w:t>
+      </w:r>
+      <w:r>
+        <w:t xml:space="preserve">.</w:t>
       </w:r>
     </w:p>
     <w:p>
@@ -18521,7 +18521,7 @@
       <w:r>
         <w:t xml:space="preserve">The source code, data download scripts, figures and this report are available in the GitHub repository </w:t>
       </w:r>
-      <w:hyperlink w:history="1" r:id="rIdzw3rrjwuzsote2chcpcv7">
+      <w:hyperlink w:history="1" r:id="rIdainhgaxflcrsh302e87i1">
         <w:r>
           <w:rPr>
             <w:rStyle w:val="Hyperlink"/>
@@ -18532,7 +18532,7 @@
       <w:r>
         <w:t xml:space="preserve"> [24] and are archived on Zenodo with the persistent identifier </w:t>
       </w:r>
-      <w:hyperlink w:history="1" r:id="rIdm05dxobfvvcn0vryedeoc">
+      <w:hyperlink w:history="1" r:id="rId8hvumdoywgdhrs6h_zy8z">
         <w:r>
           <w:rPr>
             <w:rStyle w:val="Hyperlink"/>
@@ -18543,7 +18543,7 @@
       <w:r>
         <w:t xml:space="preserve"> (concept DOI, all versions) [25]; the version described in this report (v2.0.0) is </w:t>
       </w:r>
-      <w:hyperlink w:history="1" r:id="rIdcxybxk7jm969m8pqddap1">
+      <w:hyperlink w:history="1" r:id="rIdaw6ghk04n7rzxyedrcpbj">
         <w:r>
           <w:rPr>
             <w:rStyle w:val="Hyperlink"/>
@@ -18554,7 +18554,7 @@
       <w:r>
         <w:t xml:space="preserve">, published as GitHub release </w:t>
       </w:r>
-      <w:hyperlink w:history="1" r:id="rIdkpy1edidzcjybhyxkg82m">
+      <w:hyperlink w:history="1" r:id="rIdorihf27-aqjudclvw1ru9">
         <w:r>
           <w:rPr>
             <w:rStyle w:val="Hyperlink"/>
@@ -19653,7 +19653,7 @@
       <w:r>
         <w:t xml:space="preserve">All Phase Two code, data download scripts, tests and figures are in the public repository </w:t>
       </w:r>
-      <w:hyperlink w:history="1" r:id="rIdgslzd0lgdz-zhivam59qb">
+      <w:hyperlink w:history="1" r:id="rId1ywunmjeiii4fzjyrps-p">
         <w:r>
           <w:rPr>
             <w:rStyle w:val="Hyperlink"/>
@@ -19664,7 +19664,7 @@
       <w:r>
         <w:t xml:space="preserve"> (branch main) [24], archived on Zenodo as </w:t>
       </w:r>
-      <w:hyperlink w:history="1" r:id="rIdxugpz39e-i_twp9pgjcfy">
+      <w:hyperlink w:history="1" r:id="rIdt1lj0rco90m77v3zjrtho">
         <w:r>
           <w:rPr>
             <w:rStyle w:val="Hyperlink"/>
@@ -21390,7 +21390,7 @@
         <w:sz w:val="18"/>
         <w:szCs w:val="18"/>
       </w:rPr>
-      <w:t xml:space="preserve">3D Acoustic Guidance and Localization System for Drones — Revision 2</w:t>
+      <w:t xml:space="preserve">3D Acoustic Guidance and Localization System for Drones — Version 2</w:t>
     </w:r>
   </w:p>
 </w:hdr>

</xml_diff>